<commit_message>
Entrega: ficha tecnica, benchmark com outros modelos e script de comparacao
comparar_modelo_3090.sh roda SFT + eval FastAPI + conversa para qualquer
id do Hugging Face. md_para_docx aceita \| dentro de celula de tabela.
</commit_message>
<xml_diff>
--- a/docs/ENTREGA.docx
+++ b/docs/ENTREGA.docx
@@ -33,7 +33,7 @@
       <w:r>
         <w:t xml:space="preserve">Um ajuste do </w:t>
       </w:r>
-      <w:hyperlink w:history="1" r:id="rIdf1nxvssigup6wqz6w4weh">
+      <w:hyperlink w:history="1" r:id="rId8w0_-4ta-f9rauapgyto1">
         <w:r>
           <w:rPr>
             <w:rStyle w:val="Hyperlink"/>
@@ -53,6 +53,1463 @@
         <w:t xml:space="preserve">O modelo roda nesta máquina, na GPU Intel, a cerca de 15 tokens por segundo: um arquivo FastAPI completo sai em uns 45 segundos.</w:t>
       </w:r>
     </w:p>
+    <w:p>
+      <w:pPr>
+        <w:pStyle w:val="Heading1"/>
+      </w:pPr>
+      <w:r>
+        <w:t xml:space="preserve">Ficha técnica</w:t>
+      </w:r>
+    </w:p>
+    <w:tbl>
+      <w:tblPr>
+        <w:tblW w:type="dxa" w:w="9026"/>
+        <w:tblBorders>
+          <w:top w:val="single" w:color="auto" w:sz="4"/>
+          <w:left w:val="single" w:color="auto" w:sz="4"/>
+          <w:bottom w:val="single" w:color="auto" w:sz="4"/>
+          <w:right w:val="single" w:color="auto" w:sz="4"/>
+          <w:insideH w:val="single" w:color="auto" w:sz="4"/>
+          <w:insideV w:val="single" w:color="auto" w:sz="4"/>
+        </w:tblBorders>
+      </w:tblPr>
+      <w:tblGrid>
+        <w:gridCol w:w="4513"/>
+        <w:gridCol w:w="4513"/>
+      </w:tblGrid>
+      <w:tr>
+        <w:trPr>
+          <w:tblHeader/>
+        </w:trPr>
+        <w:tc>
+          <w:tcPr>
+            <w:tcW w:type="dxa" w:w="4513"/>
+            <w:tcBorders>
+              <w:top w:val="single" w:color="BBBBBB" w:sz="4"/>
+              <w:left w:val="single" w:color="BBBBBB" w:sz="4"/>
+              <w:bottom w:val="single" w:color="BBBBBB" w:sz="4"/>
+              <w:right w:val="single" w:color="BBBBBB" w:sz="4"/>
+            </w:tcBorders>
+            <w:shd w:fill="E8EEF4" w:val="clear"/>
+            <w:tcMar>
+              <w:top w:type="dxa" w:w="60"/>
+              <w:left w:type="dxa" w:w="100"/>
+              <w:bottom w:type="dxa" w:w="60"/>
+              <w:right w:type="dxa" w:w="100"/>
+            </w:tcMar>
+          </w:tcPr>
+          <w:p>
+            <w:r>
+              <w:rPr>
+                <w:b/>
+                <w:bCs/>
+                <w:sz w:val="18"/>
+                <w:szCs w:val="18"/>
+              </w:rPr>
+              <w:t xml:space="preserve">Item</w:t>
+            </w:r>
+          </w:p>
+        </w:tc>
+        <w:tc>
+          <w:tcPr>
+            <w:tcW w:type="dxa" w:w="4513"/>
+            <w:tcBorders>
+              <w:top w:val="single" w:color="BBBBBB" w:sz="4"/>
+              <w:left w:val="single" w:color="BBBBBB" w:sz="4"/>
+              <w:bottom w:val="single" w:color="BBBBBB" w:sz="4"/>
+              <w:right w:val="single" w:color="BBBBBB" w:sz="4"/>
+            </w:tcBorders>
+            <w:shd w:fill="E8EEF4" w:val="clear"/>
+            <w:tcMar>
+              <w:top w:type="dxa" w:w="60"/>
+              <w:left w:type="dxa" w:w="100"/>
+              <w:bottom w:type="dxa" w:w="60"/>
+              <w:right w:type="dxa" w:w="100"/>
+            </w:tcMar>
+          </w:tcPr>
+          <w:p>
+            <w:r>
+              <w:rPr>
+                <w:b/>
+                <w:bCs/>
+                <w:sz w:val="18"/>
+                <w:szCs w:val="18"/>
+              </w:rPr>
+              <w:t xml:space="preserve">Valor</w:t>
+            </w:r>
+          </w:p>
+        </w:tc>
+      </w:tr>
+      <w:tr>
+        <w:trPr>
+          <w:tblHeader w:val="off"/>
+        </w:trPr>
+        <w:tc>
+          <w:tcPr>
+            <w:tcW w:type="dxa" w:w="4513"/>
+            <w:tcBorders>
+              <w:top w:val="single" w:color="BBBBBB" w:sz="4"/>
+              <w:left w:val="single" w:color="BBBBBB" w:sz="4"/>
+              <w:bottom w:val="single" w:color="BBBBBB" w:sz="4"/>
+              <w:right w:val="single" w:color="BBBBBB" w:sz="4"/>
+            </w:tcBorders>
+            <w:tcMar>
+              <w:top w:type="dxa" w:w="60"/>
+              <w:left w:type="dxa" w:w="100"/>
+              <w:bottom w:type="dxa" w:w="60"/>
+              <w:right w:type="dxa" w:w="100"/>
+            </w:tcMar>
+          </w:tcPr>
+          <w:p>
+            <w:r>
+              <w:rPr>
+                <w:b w:val="false"/>
+                <w:bCs w:val="false"/>
+                <w:sz w:val="18"/>
+                <w:szCs w:val="18"/>
+              </w:rPr>
+              <w:t xml:space="preserve">Base</w:t>
+            </w:r>
+          </w:p>
+        </w:tc>
+        <w:tc>
+          <w:tcPr>
+            <w:tcW w:type="dxa" w:w="4513"/>
+            <w:tcBorders>
+              <w:top w:val="single" w:color="BBBBBB" w:sz="4"/>
+              <w:left w:val="single" w:color="BBBBBB" w:sz="4"/>
+              <w:bottom w:val="single" w:color="BBBBBB" w:sz="4"/>
+              <w:right w:val="single" w:color="BBBBBB" w:sz="4"/>
+            </w:tcBorders>
+            <w:tcMar>
+              <w:top w:type="dxa" w:w="60"/>
+              <w:left w:type="dxa" w:w="100"/>
+              <w:bottom w:type="dxa" w:w="60"/>
+              <w:right w:type="dxa" w:w="100"/>
+            </w:tcMar>
+          </w:tcPr>
+          <w:p>
+            <w:hyperlink w:history="1" r:id="rId2dufvytjfk2cgpd-qa3jm">
+              <w:r>
+                <w:rPr>
+                  <w:rStyle w:val="Hyperlink"/>
+                  <w:b w:val="false"/>
+                  <w:bCs w:val="false"/>
+                  <w:sz w:val="18"/>
+                  <w:szCs w:val="18"/>
+                </w:rPr>
+                <w:t xml:space="preserve">AIInstituteLNCC/manaca-1b-base</w:t>
+              </w:r>
+            </w:hyperlink>
+            <w:r>
+              <w:rPr>
+                <w:b w:val="false"/>
+                <w:bCs w:val="false"/>
+                <w:sz w:val="18"/>
+                <w:szCs w:val="18"/>
+              </w:rPr>
+              <w:t xml:space="preserve">, 41,9 bilhões de tokens de pré-treino em português</w:t>
+            </w:r>
+          </w:p>
+        </w:tc>
+      </w:tr>
+      <w:tr>
+        <w:trPr>
+          <w:tblHeader w:val="off"/>
+        </w:trPr>
+        <w:tc>
+          <w:tcPr>
+            <w:tcW w:type="dxa" w:w="4513"/>
+            <w:tcBorders>
+              <w:top w:val="single" w:color="BBBBBB" w:sz="4"/>
+              <w:left w:val="single" w:color="BBBBBB" w:sz="4"/>
+              <w:bottom w:val="single" w:color="BBBBBB" w:sz="4"/>
+              <w:right w:val="single" w:color="BBBBBB" w:sz="4"/>
+            </w:tcBorders>
+            <w:tcMar>
+              <w:top w:type="dxa" w:w="60"/>
+              <w:left w:type="dxa" w:w="100"/>
+              <w:bottom w:type="dxa" w:w="60"/>
+              <w:right w:type="dxa" w:w="100"/>
+            </w:tcMar>
+          </w:tcPr>
+          <w:p>
+            <w:r>
+              <w:rPr>
+                <w:b w:val="false"/>
+                <w:bCs w:val="false"/>
+                <w:sz w:val="18"/>
+                <w:szCs w:val="18"/>
+              </w:rPr>
+              <w:t xml:space="preserve">Arquitetura</w:t>
+            </w:r>
+          </w:p>
+        </w:tc>
+        <w:tc>
+          <w:tcPr>
+            <w:tcW w:type="dxa" w:w="4513"/>
+            <w:tcBorders>
+              <w:top w:val="single" w:color="BBBBBB" w:sz="4"/>
+              <w:left w:val="single" w:color="BBBBBB" w:sz="4"/>
+              <w:bottom w:val="single" w:color="BBBBBB" w:sz="4"/>
+              <w:right w:val="single" w:color="BBBBBB" w:sz="4"/>
+            </w:tcBorders>
+            <w:tcMar>
+              <w:top w:type="dxa" w:w="60"/>
+              <w:left w:type="dxa" w:w="100"/>
+              <w:bottom w:type="dxa" w:w="60"/>
+              <w:right w:type="dxa" w:w="100"/>
+            </w:tcMar>
+          </w:tcPr>
+          <w:p>
+            <w:r>
+              <w:rPr>
+                <w:rFonts w:ascii="Consolas" w:cs="Consolas" w:eastAsia="Consolas" w:hAnsi="Consolas"/>
+                <w:b w:val="false"/>
+                <w:bCs w:val="false"/>
+                <w:sz w:val="18"/>
+                <w:szCs w:val="18"/>
+              </w:rPr>
+              <w:t xml:space="preserve">LlamaForCausalLM</w:t>
+            </w:r>
+            <w:r>
+              <w:rPr>
+                <w:b w:val="false"/>
+                <w:bCs w:val="false"/>
+                <w:sz w:val="18"/>
+                <w:szCs w:val="18"/>
+              </w:rPr>
+              <w:t xml:space="preserve">, 1,72 bilhão de parâmetros</w:t>
+            </w:r>
+          </w:p>
+        </w:tc>
+      </w:tr>
+      <w:tr>
+        <w:trPr>
+          <w:tblHeader w:val="off"/>
+        </w:trPr>
+        <w:tc>
+          <w:tcPr>
+            <w:tcW w:type="dxa" w:w="4513"/>
+            <w:tcBorders>
+              <w:top w:val="single" w:color="BBBBBB" w:sz="4"/>
+              <w:left w:val="single" w:color="BBBBBB" w:sz="4"/>
+              <w:bottom w:val="single" w:color="BBBBBB" w:sz="4"/>
+              <w:right w:val="single" w:color="BBBBBB" w:sz="4"/>
+            </w:tcBorders>
+            <w:tcMar>
+              <w:top w:type="dxa" w:w="60"/>
+              <w:left w:type="dxa" w:w="100"/>
+              <w:bottom w:type="dxa" w:w="60"/>
+              <w:right w:type="dxa" w:w="100"/>
+            </w:tcMar>
+          </w:tcPr>
+          <w:p>
+            <w:r>
+              <w:rPr>
+                <w:b w:val="false"/>
+                <w:bCs w:val="false"/>
+                <w:sz w:val="18"/>
+                <w:szCs w:val="18"/>
+              </w:rPr>
+              <w:t xml:space="preserve">Camadas</w:t>
+            </w:r>
+          </w:p>
+        </w:tc>
+        <w:tc>
+          <w:tcPr>
+            <w:tcW w:type="dxa" w:w="4513"/>
+            <w:tcBorders>
+              <w:top w:val="single" w:color="BBBBBB" w:sz="4"/>
+              <w:left w:val="single" w:color="BBBBBB" w:sz="4"/>
+              <w:bottom w:val="single" w:color="BBBBBB" w:sz="4"/>
+              <w:right w:val="single" w:color="BBBBBB" w:sz="4"/>
+            </w:tcBorders>
+            <w:tcMar>
+              <w:top w:type="dxa" w:w="60"/>
+              <w:left w:type="dxa" w:w="100"/>
+              <w:bottom w:type="dxa" w:w="60"/>
+              <w:right w:type="dxa" w:w="100"/>
+            </w:tcMar>
+          </w:tcPr>
+          <w:p>
+            <w:r>
+              <w:rPr>
+                <w:b w:val="false"/>
+                <w:bCs w:val="false"/>
+                <w:sz w:val="18"/>
+                <w:szCs w:val="18"/>
+              </w:rPr>
+              <w:t xml:space="preserve">24, dimensão 2048, MLP 8192</w:t>
+            </w:r>
+          </w:p>
+        </w:tc>
+      </w:tr>
+      <w:tr>
+        <w:trPr>
+          <w:tblHeader w:val="off"/>
+        </w:trPr>
+        <w:tc>
+          <w:tcPr>
+            <w:tcW w:type="dxa" w:w="4513"/>
+            <w:tcBorders>
+              <w:top w:val="single" w:color="BBBBBB" w:sz="4"/>
+              <w:left w:val="single" w:color="BBBBBB" w:sz="4"/>
+              <w:bottom w:val="single" w:color="BBBBBB" w:sz="4"/>
+              <w:right w:val="single" w:color="BBBBBB" w:sz="4"/>
+            </w:tcBorders>
+            <w:tcMar>
+              <w:top w:type="dxa" w:w="60"/>
+              <w:left w:type="dxa" w:w="100"/>
+              <w:bottom w:type="dxa" w:w="60"/>
+              <w:right w:type="dxa" w:w="100"/>
+            </w:tcMar>
+          </w:tcPr>
+          <w:p>
+            <w:r>
+              <w:rPr>
+                <w:b w:val="false"/>
+                <w:bCs w:val="false"/>
+                <w:sz w:val="18"/>
+                <w:szCs w:val="18"/>
+              </w:rPr>
+              <w:t xml:space="preserve">Atenção</w:t>
+            </w:r>
+          </w:p>
+        </w:tc>
+        <w:tc>
+          <w:tcPr>
+            <w:tcW w:type="dxa" w:w="4513"/>
+            <w:tcBorders>
+              <w:top w:val="single" w:color="BBBBBB" w:sz="4"/>
+              <w:left w:val="single" w:color="BBBBBB" w:sz="4"/>
+              <w:bottom w:val="single" w:color="BBBBBB" w:sz="4"/>
+              <w:right w:val="single" w:color="BBBBBB" w:sz="4"/>
+            </w:tcBorders>
+            <w:tcMar>
+              <w:top w:type="dxa" w:w="60"/>
+              <w:left w:type="dxa" w:w="100"/>
+              <w:bottom w:type="dxa" w:w="60"/>
+              <w:right w:type="dxa" w:w="100"/>
+            </w:tcMar>
+          </w:tcPr>
+          <w:p>
+            <w:r>
+              <w:rPr>
+                <w:b w:val="false"/>
+                <w:bCs w:val="false"/>
+                <w:sz w:val="18"/>
+                <w:szCs w:val="18"/>
+              </w:rPr>
+              <w:t xml:space="preserve">32 cabeças, 8 de chave e valor (GQA), RoPE com theta 500.000</w:t>
+            </w:r>
+          </w:p>
+        </w:tc>
+      </w:tr>
+      <w:tr>
+        <w:trPr>
+          <w:tblHeader w:val="off"/>
+        </w:trPr>
+        <w:tc>
+          <w:tcPr>
+            <w:tcW w:type="dxa" w:w="4513"/>
+            <w:tcBorders>
+              <w:top w:val="single" w:color="BBBBBB" w:sz="4"/>
+              <w:left w:val="single" w:color="BBBBBB" w:sz="4"/>
+              <w:bottom w:val="single" w:color="BBBBBB" w:sz="4"/>
+              <w:right w:val="single" w:color="BBBBBB" w:sz="4"/>
+            </w:tcBorders>
+            <w:tcMar>
+              <w:top w:type="dxa" w:w="60"/>
+              <w:left w:type="dxa" w:w="100"/>
+              <w:bottom w:type="dxa" w:w="60"/>
+              <w:right w:type="dxa" w:w="100"/>
+            </w:tcMar>
+          </w:tcPr>
+          <w:p>
+            <w:r>
+              <w:rPr>
+                <w:b w:val="false"/>
+                <w:bCs w:val="false"/>
+                <w:sz w:val="18"/>
+                <w:szCs w:val="18"/>
+              </w:rPr>
+              <w:t xml:space="preserve">Contexto máximo da arquitetura</w:t>
+            </w:r>
+          </w:p>
+        </w:tc>
+        <w:tc>
+          <w:tcPr>
+            <w:tcW w:type="dxa" w:w="4513"/>
+            <w:tcBorders>
+              <w:top w:val="single" w:color="BBBBBB" w:sz="4"/>
+              <w:left w:val="single" w:color="BBBBBB" w:sz="4"/>
+              <w:bottom w:val="single" w:color="BBBBBB" w:sz="4"/>
+              <w:right w:val="single" w:color="BBBBBB" w:sz="4"/>
+            </w:tcBorders>
+            <w:tcMar>
+              <w:top w:type="dxa" w:w="60"/>
+              <w:left w:type="dxa" w:w="100"/>
+              <w:bottom w:type="dxa" w:w="60"/>
+              <w:right w:type="dxa" w:w="100"/>
+            </w:tcMar>
+          </w:tcPr>
+          <w:p>
+            <w:r>
+              <w:rPr>
+                <w:b w:val="false"/>
+                <w:bCs w:val="false"/>
+                <w:sz w:val="18"/>
+                <w:szCs w:val="18"/>
+              </w:rPr>
+              <w:t xml:space="preserve">4.096 tokens (</w:t>
+            </w:r>
+            <w:r>
+              <w:rPr>
+                <w:rFonts w:ascii="Consolas" w:cs="Consolas" w:eastAsia="Consolas" w:hAnsi="Consolas"/>
+                <w:b w:val="false"/>
+                <w:bCs w:val="false"/>
+                <w:sz w:val="18"/>
+                <w:szCs w:val="18"/>
+              </w:rPr>
+              <w:t xml:space="preserve">max_position_embeddings</w:t>
+            </w:r>
+            <w:r>
+              <w:rPr>
+                <w:b w:val="false"/>
+                <w:bCs w:val="false"/>
+                <w:sz w:val="18"/>
+                <w:szCs w:val="18"/>
+              </w:rPr>
+              <w:t xml:space="preserve">), prompt e resposta somados</w:t>
+            </w:r>
+          </w:p>
+        </w:tc>
+      </w:tr>
+      <w:tr>
+        <w:trPr>
+          <w:tblHeader w:val="off"/>
+        </w:trPr>
+        <w:tc>
+          <w:tcPr>
+            <w:tcW w:type="dxa" w:w="4513"/>
+            <w:tcBorders>
+              <w:top w:val="single" w:color="BBBBBB" w:sz="4"/>
+              <w:left w:val="single" w:color="BBBBBB" w:sz="4"/>
+              <w:bottom w:val="single" w:color="BBBBBB" w:sz="4"/>
+              <w:right w:val="single" w:color="BBBBBB" w:sz="4"/>
+            </w:tcBorders>
+            <w:tcMar>
+              <w:top w:type="dxa" w:w="60"/>
+              <w:left w:type="dxa" w:w="100"/>
+              <w:bottom w:type="dxa" w:w="60"/>
+              <w:right w:type="dxa" w:w="100"/>
+            </w:tcMar>
+          </w:tcPr>
+          <w:p>
+            <w:r>
+              <w:rPr>
+                <w:b w:val="false"/>
+                <w:bCs w:val="false"/>
+                <w:sz w:val="18"/>
+                <w:szCs w:val="18"/>
+              </w:rPr>
+              <w:t xml:space="preserve">Contexto usado no treino</w:t>
+            </w:r>
+          </w:p>
+        </w:tc>
+        <w:tc>
+          <w:tcPr>
+            <w:tcW w:type="dxa" w:w="4513"/>
+            <w:tcBorders>
+              <w:top w:val="single" w:color="BBBBBB" w:sz="4"/>
+              <w:left w:val="single" w:color="BBBBBB" w:sz="4"/>
+              <w:bottom w:val="single" w:color="BBBBBB" w:sz="4"/>
+              <w:right w:val="single" w:color="BBBBBB" w:sz="4"/>
+            </w:tcBorders>
+            <w:tcMar>
+              <w:top w:type="dxa" w:w="60"/>
+              <w:left w:type="dxa" w:w="100"/>
+              <w:bottom w:type="dxa" w:w="60"/>
+              <w:right w:type="dxa" w:w="100"/>
+            </w:tcMar>
+          </w:tcPr>
+          <w:p>
+            <w:r>
+              <w:rPr>
+                <w:b w:val="false"/>
+                <w:bCs w:val="false"/>
+                <w:sz w:val="18"/>
+                <w:szCs w:val="18"/>
+              </w:rPr>
+              <w:t xml:space="preserve">2.048 tokens (blocos do CPT e </w:t>
+            </w:r>
+            <w:r>
+              <w:rPr>
+                <w:rFonts w:ascii="Consolas" w:cs="Consolas" w:eastAsia="Consolas" w:hAnsi="Consolas"/>
+                <w:b w:val="false"/>
+                <w:bCs w:val="false"/>
+                <w:sz w:val="18"/>
+                <w:szCs w:val="18"/>
+              </w:rPr>
+              <w:t xml:space="preserve">--max-seq</w:t>
+            </w:r>
+            <w:r>
+              <w:rPr>
+                <w:b w:val="false"/>
+                <w:bCs w:val="false"/>
+                <w:sz w:val="18"/>
+                <w:szCs w:val="18"/>
+              </w:rPr>
+              <w:t xml:space="preserve"> do SFT); acima disso, não medido</w:t>
+            </w:r>
+          </w:p>
+        </w:tc>
+      </w:tr>
+      <w:tr>
+        <w:trPr>
+          <w:tblHeader w:val="off"/>
+        </w:trPr>
+        <w:tc>
+          <w:tcPr>
+            <w:tcW w:type="dxa" w:w="4513"/>
+            <w:tcBorders>
+              <w:top w:val="single" w:color="BBBBBB" w:sz="4"/>
+              <w:left w:val="single" w:color="BBBBBB" w:sz="4"/>
+              <w:bottom w:val="single" w:color="BBBBBB" w:sz="4"/>
+              <w:right w:val="single" w:color="BBBBBB" w:sz="4"/>
+            </w:tcBorders>
+            <w:tcMar>
+              <w:top w:type="dxa" w:w="60"/>
+              <w:left w:type="dxa" w:w="100"/>
+              <w:bottom w:type="dxa" w:w="60"/>
+              <w:right w:type="dxa" w:w="100"/>
+            </w:tcMar>
+          </w:tcPr>
+          <w:p>
+            <w:r>
+              <w:rPr>
+                <w:b w:val="false"/>
+                <w:bCs w:val="false"/>
+                <w:sz w:val="18"/>
+                <w:szCs w:val="18"/>
+              </w:rPr>
+              <w:t xml:space="preserve">Tamanho típico de uma resposta FastAPI</w:t>
+            </w:r>
+          </w:p>
+        </w:tc>
+        <w:tc>
+          <w:tcPr>
+            <w:tcW w:type="dxa" w:w="4513"/>
+            <w:tcBorders>
+              <w:top w:val="single" w:color="BBBBBB" w:sz="4"/>
+              <w:left w:val="single" w:color="BBBBBB" w:sz="4"/>
+              <w:bottom w:val="single" w:color="BBBBBB" w:sz="4"/>
+              <w:right w:val="single" w:color="BBBBBB" w:sz="4"/>
+            </w:tcBorders>
+            <w:tcMar>
+              <w:top w:type="dxa" w:w="60"/>
+              <w:left w:type="dxa" w:w="100"/>
+              <w:bottom w:type="dxa" w:w="60"/>
+              <w:right w:type="dxa" w:w="100"/>
+            </w:tcMar>
+          </w:tcPr>
+          <w:p>
+            <w:r>
+              <w:rPr>
+                <w:b w:val="false"/>
+                <w:bCs w:val="false"/>
+                <w:sz w:val="18"/>
+                <w:szCs w:val="18"/>
+              </w:rPr>
+              <w:t xml:space="preserve">cerca de 790 tokens no formato com marcadores</w:t>
+            </w:r>
+          </w:p>
+        </w:tc>
+      </w:tr>
+      <w:tr>
+        <w:trPr>
+          <w:tblHeader w:val="off"/>
+        </w:trPr>
+        <w:tc>
+          <w:tcPr>
+            <w:tcW w:type="dxa" w:w="4513"/>
+            <w:tcBorders>
+              <w:top w:val="single" w:color="BBBBBB" w:sz="4"/>
+              <w:left w:val="single" w:color="BBBBBB" w:sz="4"/>
+              <w:bottom w:val="single" w:color="BBBBBB" w:sz="4"/>
+              <w:right w:val="single" w:color="BBBBBB" w:sz="4"/>
+            </w:tcBorders>
+            <w:tcMar>
+              <w:top w:type="dxa" w:w="60"/>
+              <w:left w:type="dxa" w:w="100"/>
+              <w:bottom w:type="dxa" w:w="60"/>
+              <w:right w:type="dxa" w:w="100"/>
+            </w:tcMar>
+          </w:tcPr>
+          <w:p>
+            <w:r>
+              <w:rPr>
+                <w:b w:val="false"/>
+                <w:bCs w:val="false"/>
+                <w:sz w:val="18"/>
+                <w:szCs w:val="18"/>
+              </w:rPr>
+              <w:t xml:space="preserve">Tokenizer</w:t>
+            </w:r>
+          </w:p>
+        </w:tc>
+        <w:tc>
+          <w:tcPr>
+            <w:tcW w:type="dxa" w:w="4513"/>
+            <w:tcBorders>
+              <w:top w:val="single" w:color="BBBBBB" w:sz="4"/>
+              <w:left w:val="single" w:color="BBBBBB" w:sz="4"/>
+              <w:bottom w:val="single" w:color="BBBBBB" w:sz="4"/>
+              <w:right w:val="single" w:color="BBBBBB" w:sz="4"/>
+            </w:tcBorders>
+            <w:tcMar>
+              <w:top w:type="dxa" w:w="60"/>
+              <w:left w:type="dxa" w:w="100"/>
+              <w:bottom w:type="dxa" w:w="60"/>
+              <w:right w:type="dxa" w:w="100"/>
+            </w:tcMar>
+          </w:tcPr>
+          <w:p>
+            <w:r>
+              <w:rPr>
+                <w:b w:val="false"/>
+                <w:bCs w:val="false"/>
+                <w:sz w:val="18"/>
+                <w:szCs w:val="18"/>
+              </w:rPr>
+              <w:t xml:space="preserve">v4: o Unigram original do Manacá (64.000 peças, minúsculas) mais </w:t>
+            </w:r>
+            <w:r>
+              <w:rPr>
+                <w:rFonts w:ascii="Consolas" w:cs="Consolas" w:eastAsia="Consolas" w:hAnsi="Consolas"/>
+                <w:b w:val="false"/>
+                <w:bCs w:val="false"/>
+                <w:sz w:val="18"/>
+                <w:szCs w:val="18"/>
+              </w:rPr>
+              <w:t xml:space="preserve">&lt;|maj|&gt;</w:t>
+            </w:r>
+            <w:r>
+              <w:rPr>
+                <w:b w:val="false"/>
+                <w:bCs w:val="false"/>
+                <w:sz w:val="18"/>
+                <w:szCs w:val="18"/>
+              </w:rPr>
+              <w:t xml:space="preserve">, </w:t>
+            </w:r>
+            <w:r>
+              <w:rPr>
+                <w:rFonts w:ascii="Consolas" w:cs="Consolas" w:eastAsia="Consolas" w:hAnsi="Consolas"/>
+                <w:b w:val="false"/>
+                <w:bCs w:val="false"/>
+                <w:sz w:val="18"/>
+                <w:szCs w:val="18"/>
+              </w:rPr>
+              <w:t xml:space="preserve">&lt;|mai|&gt;</w:t>
+            </w:r>
+            <w:r>
+              <w:rPr>
+                <w:b w:val="false"/>
+                <w:bCs w:val="false"/>
+                <w:sz w:val="18"/>
+                <w:szCs w:val="18"/>
+              </w:rPr>
+              <w:t xml:space="preserve"> e </w:t>
+            </w:r>
+            <w:r>
+              <w:rPr>
+                <w:rFonts w:ascii="Consolas" w:cs="Consolas" w:eastAsia="Consolas" w:hAnsi="Consolas"/>
+                <w:b w:val="false"/>
+                <w:bCs w:val="false"/>
+                <w:sz w:val="18"/>
+                <w:szCs w:val="18"/>
+              </w:rPr>
+              <w:t xml:space="preserve">&lt;|cola|&gt;</w:t>
+            </w:r>
+            <w:r>
+              <w:rPr>
+                <w:b w:val="false"/>
+                <w:bCs w:val="false"/>
+                <w:sz w:val="18"/>
+                <w:szCs w:val="18"/>
+              </w:rPr>
+              <w:t xml:space="preserve">, total 64.003</w:t>
+            </w:r>
+          </w:p>
+        </w:tc>
+      </w:tr>
+      <w:tr>
+        <w:trPr>
+          <w:tblHeader w:val="off"/>
+        </w:trPr>
+        <w:tc>
+          <w:tcPr>
+            <w:tcW w:type="dxa" w:w="4513"/>
+            <w:tcBorders>
+              <w:top w:val="single" w:color="BBBBBB" w:sz="4"/>
+              <w:left w:val="single" w:color="BBBBBB" w:sz="4"/>
+              <w:bottom w:val="single" w:color="BBBBBB" w:sz="4"/>
+              <w:right w:val="single" w:color="BBBBBB" w:sz="4"/>
+            </w:tcBorders>
+            <w:tcMar>
+              <w:top w:type="dxa" w:w="60"/>
+              <w:left w:type="dxa" w:w="100"/>
+              <w:bottom w:type="dxa" w:w="60"/>
+              <w:right w:type="dxa" w:w="100"/>
+            </w:tcMar>
+          </w:tcPr>
+          <w:p>
+            <w:r>
+              <w:rPr>
+                <w:b w:val="false"/>
+                <w:bCs w:val="false"/>
+                <w:sz w:val="18"/>
+                <w:szCs w:val="18"/>
+              </w:rPr>
+              <w:t xml:space="preserve">Pré e pós-processamento</w:t>
+            </w:r>
+          </w:p>
+        </w:tc>
+        <w:tc>
+          <w:tcPr>
+            <w:tcW w:type="dxa" w:w="4513"/>
+            <w:tcBorders>
+              <w:top w:val="single" w:color="BBBBBB" w:sz="4"/>
+              <w:left w:val="single" w:color="BBBBBB" w:sz="4"/>
+              <w:bottom w:val="single" w:color="BBBBBB" w:sz="4"/>
+              <w:right w:val="single" w:color="BBBBBB" w:sz="4"/>
+            </w:tcBorders>
+            <w:tcMar>
+              <w:top w:type="dxa" w:w="60"/>
+              <w:left w:type="dxa" w:w="100"/>
+              <w:bottom w:type="dxa" w:w="60"/>
+              <w:right w:type="dxa" w:w="100"/>
+            </w:tcMar>
+          </w:tcPr>
+          <w:p>
+            <w:r>
+              <w:rPr>
+                <w:b w:val="false"/>
+                <w:bCs w:val="false"/>
+                <w:sz w:val="18"/>
+                <w:szCs w:val="18"/>
+              </w:rPr>
+              <w:t xml:space="preserve">obrigatórios: </w:t>
+            </w:r>
+            <w:r>
+              <w:rPr>
+                <w:rFonts w:ascii="Consolas" w:cs="Consolas" w:eastAsia="Consolas" w:hAnsi="Consolas"/>
+                <w:b w:val="false"/>
+                <w:bCs w:val="false"/>
+                <w:sz w:val="18"/>
+                <w:szCs w:val="18"/>
+              </w:rPr>
+              <w:t xml:space="preserve">scripts/caixa_marcada.py</w:t>
+            </w:r>
+            <w:r>
+              <w:rPr>
+                <w:b w:val="false"/>
+                <w:bCs w:val="false"/>
+                <w:sz w:val="18"/>
+                <w:szCs w:val="18"/>
+              </w:rPr>
+              <w:t xml:space="preserve"> codifica a entrada e decodifica a saída (maiúscula e espaço viram marcadores)</w:t>
+            </w:r>
+          </w:p>
+        </w:tc>
+      </w:tr>
+      <w:tr>
+        <w:trPr>
+          <w:tblHeader w:val="off"/>
+        </w:trPr>
+        <w:tc>
+          <w:tcPr>
+            <w:tcW w:type="dxa" w:w="4513"/>
+            <w:tcBorders>
+              <w:top w:val="single" w:color="BBBBBB" w:sz="4"/>
+              <w:left w:val="single" w:color="BBBBBB" w:sz="4"/>
+              <w:bottom w:val="single" w:color="BBBBBB" w:sz="4"/>
+              <w:right w:val="single" w:color="BBBBBB" w:sz="4"/>
+            </w:tcBorders>
+            <w:tcMar>
+              <w:top w:type="dxa" w:w="60"/>
+              <w:left w:type="dxa" w:w="100"/>
+              <w:bottom w:type="dxa" w:w="60"/>
+              <w:right w:type="dxa" w:w="100"/>
+            </w:tcMar>
+          </w:tcPr>
+          <w:p>
+            <w:r>
+              <w:rPr>
+                <w:b w:val="false"/>
+                <w:bCs w:val="false"/>
+                <w:sz w:val="18"/>
+                <w:szCs w:val="18"/>
+              </w:rPr>
+              <w:t xml:space="preserve">Template</w:t>
+            </w:r>
+          </w:p>
+        </w:tc>
+        <w:tc>
+          <w:tcPr>
+            <w:tcW w:type="dxa" w:w="4513"/>
+            <w:tcBorders>
+              <w:top w:val="single" w:color="BBBBBB" w:sz="4"/>
+              <w:left w:val="single" w:color="BBBBBB" w:sz="4"/>
+              <w:bottom w:val="single" w:color="BBBBBB" w:sz="4"/>
+              <w:right w:val="single" w:color="BBBBBB" w:sz="4"/>
+            </w:tcBorders>
+            <w:tcMar>
+              <w:top w:type="dxa" w:w="60"/>
+              <w:left w:type="dxa" w:w="100"/>
+              <w:bottom w:type="dxa" w:w="60"/>
+              <w:right w:type="dxa" w:w="100"/>
+            </w:tcMar>
+          </w:tcPr>
+          <w:p>
+            <w:r>
+              <w:rPr>
+                <w:b w:val="false"/>
+                <w:bCs w:val="false"/>
+                <w:sz w:val="18"/>
+                <w:szCs w:val="18"/>
+              </w:rPr>
+              <w:t xml:space="preserve">Alpaca-PT do LNCC (</w:t>
+            </w:r>
+            <w:r>
+              <w:rPr>
+                <w:rFonts w:ascii="Consolas" w:cs="Consolas" w:eastAsia="Consolas" w:hAnsi="Consolas"/>
+                <w:b w:val="false"/>
+                <w:bCs w:val="false"/>
+                <w:sz w:val="18"/>
+                <w:szCs w:val="18"/>
+              </w:rPr>
+              <w:t xml:space="preserve">### Instrução:</w:t>
+            </w:r>
+            <w:r>
+              <w:rPr>
+                <w:b w:val="false"/>
+                <w:bCs w:val="false"/>
+                <w:sz w:val="18"/>
+                <w:szCs w:val="18"/>
+              </w:rPr>
+              <w:t xml:space="preserve">, </w:t>
+            </w:r>
+            <w:r>
+              <w:rPr>
+                <w:rFonts w:ascii="Consolas" w:cs="Consolas" w:eastAsia="Consolas" w:hAnsi="Consolas"/>
+                <w:b w:val="false"/>
+                <w:bCs w:val="false"/>
+                <w:sz w:val="18"/>
+                <w:szCs w:val="18"/>
+              </w:rPr>
+              <w:t xml:space="preserve">### Entrada:</w:t>
+            </w:r>
+            <w:r>
+              <w:rPr>
+                <w:b w:val="false"/>
+                <w:bCs w:val="false"/>
+                <w:sz w:val="18"/>
+                <w:szCs w:val="18"/>
+              </w:rPr>
+              <w:t xml:space="preserve">, </w:t>
+            </w:r>
+            <w:r>
+              <w:rPr>
+                <w:rFonts w:ascii="Consolas" w:cs="Consolas" w:eastAsia="Consolas" w:hAnsi="Consolas"/>
+                <w:b w:val="false"/>
+                <w:bCs w:val="false"/>
+                <w:sz w:val="18"/>
+                <w:szCs w:val="18"/>
+              </w:rPr>
+              <w:t xml:space="preserve">### Resposta:</w:t>
+            </w:r>
+            <w:r>
+              <w:rPr>
+                <w:b w:val="false"/>
+                <w:bCs w:val="false"/>
+                <w:sz w:val="18"/>
+                <w:szCs w:val="18"/>
+              </w:rPr>
+              <w:t xml:space="preserve">), gravado no adapter como </w:t>
+            </w:r>
+            <w:r>
+              <w:rPr>
+                <w:rFonts w:ascii="Consolas" w:cs="Consolas" w:eastAsia="Consolas" w:hAnsi="Consolas"/>
+                <w:b w:val="false"/>
+                <w:bCs w:val="false"/>
+                <w:sz w:val="18"/>
+                <w:szCs w:val="18"/>
+              </w:rPr>
+              <w:t xml:space="preserve">template.json</w:t>
+            </w:r>
+            <w:r>
+              <w:rPr>
+                <w:b w:val="false"/>
+                <w:bCs w:val="false"/>
+                <w:sz w:val="18"/>
+                <w:szCs w:val="18"/>
+              </w:rPr>
+              <w:t xml:space="preserve"> = </w:t>
+            </w:r>
+            <w:r>
+              <w:rPr>
+                <w:rFonts w:ascii="Consolas" w:cs="Consolas" w:eastAsia="Consolas" w:hAnsi="Consolas"/>
+                <w:b w:val="false"/>
+                <w:bCs w:val="false"/>
+                <w:sz w:val="18"/>
+                <w:szCs w:val="18"/>
+              </w:rPr>
+              <w:t xml:space="preserve">lncc</w:t>
+            </w:r>
+          </w:p>
+        </w:tc>
+      </w:tr>
+      <w:tr>
+        <w:trPr>
+          <w:tblHeader w:val="off"/>
+        </w:trPr>
+        <w:tc>
+          <w:tcPr>
+            <w:tcW w:type="dxa" w:w="4513"/>
+            <w:tcBorders>
+              <w:top w:val="single" w:color="BBBBBB" w:sz="4"/>
+              <w:left w:val="single" w:color="BBBBBB" w:sz="4"/>
+              <w:bottom w:val="single" w:color="BBBBBB" w:sz="4"/>
+              <w:right w:val="single" w:color="BBBBBB" w:sz="4"/>
+            </w:tcBorders>
+            <w:tcMar>
+              <w:top w:type="dxa" w:w="60"/>
+              <w:left w:type="dxa" w:w="100"/>
+              <w:bottom w:type="dxa" w:w="60"/>
+              <w:right w:type="dxa" w:w="100"/>
+            </w:tcMar>
+          </w:tcPr>
+          <w:p>
+            <w:r>
+              <w:rPr>
+                <w:b w:val="false"/>
+                <w:bCs w:val="false"/>
+                <w:sz w:val="18"/>
+                <w:szCs w:val="18"/>
+              </w:rPr>
+              <w:t xml:space="preserve">Tokens especiais</w:t>
+            </w:r>
+          </w:p>
+        </w:tc>
+        <w:tc>
+          <w:tcPr>
+            <w:tcW w:type="dxa" w:w="4513"/>
+            <w:tcBorders>
+              <w:top w:val="single" w:color="BBBBBB" w:sz="4"/>
+              <w:left w:val="single" w:color="BBBBBB" w:sz="4"/>
+              <w:bottom w:val="single" w:color="BBBBBB" w:sz="4"/>
+              <w:right w:val="single" w:color="BBBBBB" w:sz="4"/>
+            </w:tcBorders>
+            <w:tcMar>
+              <w:top w:type="dxa" w:w="60"/>
+              <w:left w:type="dxa" w:w="100"/>
+              <w:bottom w:type="dxa" w:w="60"/>
+              <w:right w:type="dxa" w:w="100"/>
+            </w:tcMar>
+          </w:tcPr>
+          <w:p>
+            <w:r>
+              <w:rPr>
+                <w:rFonts w:ascii="Consolas" w:cs="Consolas" w:eastAsia="Consolas" w:hAnsi="Consolas"/>
+                <w:b w:val="false"/>
+                <w:bCs w:val="false"/>
+                <w:sz w:val="18"/>
+                <w:szCs w:val="18"/>
+              </w:rPr>
+              <w:t xml:space="preserve">&lt;s&gt;</w:t>
+            </w:r>
+            <w:r>
+              <w:rPr>
+                <w:b w:val="false"/>
+                <w:bCs w:val="false"/>
+                <w:sz w:val="18"/>
+                <w:szCs w:val="18"/>
+              </w:rPr>
+              <w:t xml:space="preserve"> = 1 (BOS), </w:t>
+            </w:r>
+            <w:r>
+              <w:rPr>
+                <w:rFonts w:ascii="Consolas" w:cs="Consolas" w:eastAsia="Consolas" w:hAnsi="Consolas"/>
+                <w:b w:val="false"/>
+                <w:bCs w:val="false"/>
+                <w:sz w:val="18"/>
+                <w:szCs w:val="18"/>
+              </w:rPr>
+              <w:t xml:space="preserve">&lt;/s&gt;</w:t>
+            </w:r>
+            <w:r>
+              <w:rPr>
+                <w:b w:val="false"/>
+                <w:bCs w:val="false"/>
+                <w:sz w:val="18"/>
+                <w:szCs w:val="18"/>
+              </w:rPr>
+              <w:t xml:space="preserve"> = 2 (EOS), </w:t>
+            </w:r>
+            <w:r>
+              <w:rPr>
+                <w:rFonts w:ascii="Consolas" w:cs="Consolas" w:eastAsia="Consolas" w:hAnsi="Consolas"/>
+                <w:b w:val="false"/>
+                <w:bCs w:val="false"/>
+                <w:sz w:val="18"/>
+                <w:szCs w:val="18"/>
+              </w:rPr>
+              <w:t xml:space="preserve">&lt;pad&gt;</w:t>
+            </w:r>
+            <w:r>
+              <w:rPr>
+                <w:b w:val="false"/>
+                <w:bCs w:val="false"/>
+                <w:sz w:val="18"/>
+                <w:szCs w:val="18"/>
+              </w:rPr>
+              <w:t xml:space="preserve"> = 3</w:t>
+            </w:r>
+          </w:p>
+        </w:tc>
+      </w:tr>
+      <w:tr>
+        <w:trPr>
+          <w:tblHeader w:val="off"/>
+        </w:trPr>
+        <w:tc>
+          <w:tcPr>
+            <w:tcW w:type="dxa" w:w="4513"/>
+            <w:tcBorders>
+              <w:top w:val="single" w:color="BBBBBB" w:sz="4"/>
+              <w:left w:val="single" w:color="BBBBBB" w:sz="4"/>
+              <w:bottom w:val="single" w:color="BBBBBB" w:sz="4"/>
+              <w:right w:val="single" w:color="BBBBBB" w:sz="4"/>
+            </w:tcBorders>
+            <w:tcMar>
+              <w:top w:type="dxa" w:w="60"/>
+              <w:left w:type="dxa" w:w="100"/>
+              <w:bottom w:type="dxa" w:w="60"/>
+              <w:right w:type="dxa" w:w="100"/>
+            </w:tcMar>
+          </w:tcPr>
+          <w:p>
+            <w:r>
+              <w:rPr>
+                <w:b w:val="false"/>
+                <w:bCs w:val="false"/>
+                <w:sz w:val="18"/>
+                <w:szCs w:val="18"/>
+              </w:rPr>
+              <w:t xml:space="preserve">Pré-treino continuado</w:t>
+            </w:r>
+          </w:p>
+        </w:tc>
+        <w:tc>
+          <w:tcPr>
+            <w:tcW w:type="dxa" w:w="4513"/>
+            <w:tcBorders>
+              <w:top w:val="single" w:color="BBBBBB" w:sz="4"/>
+              <w:left w:val="single" w:color="BBBBBB" w:sz="4"/>
+              <w:bottom w:val="single" w:color="BBBBBB" w:sz="4"/>
+              <w:right w:val="single" w:color="BBBBBB" w:sz="4"/>
+            </w:tcBorders>
+            <w:tcMar>
+              <w:top w:type="dxa" w:w="60"/>
+              <w:left w:type="dxa" w:w="100"/>
+              <w:bottom w:type="dxa" w:w="60"/>
+              <w:right w:type="dxa" w:w="100"/>
+            </w:tcMar>
+          </w:tcPr>
+          <w:p>
+            <w:r>
+              <w:rPr>
+                <w:b w:val="false"/>
+                <w:bCs w:val="false"/>
+                <w:sz w:val="18"/>
+                <w:szCs w:val="18"/>
+              </w:rPr>
+              <w:t xml:space="preserve">cerca de 250 milhões de tokens em três etapas, pesos completos em bf16</w:t>
+            </w:r>
+          </w:p>
+        </w:tc>
+      </w:tr>
+      <w:tr>
+        <w:trPr>
+          <w:tblHeader w:val="off"/>
+        </w:trPr>
+        <w:tc>
+          <w:tcPr>
+            <w:tcW w:type="dxa" w:w="4513"/>
+            <w:tcBorders>
+              <w:top w:val="single" w:color="BBBBBB" w:sz="4"/>
+              <w:left w:val="single" w:color="BBBBBB" w:sz="4"/>
+              <w:bottom w:val="single" w:color="BBBBBB" w:sz="4"/>
+              <w:right w:val="single" w:color="BBBBBB" w:sz="4"/>
+            </w:tcBorders>
+            <w:tcMar>
+              <w:top w:type="dxa" w:w="60"/>
+              <w:left w:type="dxa" w:w="100"/>
+              <w:bottom w:type="dxa" w:w="60"/>
+              <w:right w:type="dxa" w:w="100"/>
+            </w:tcMar>
+          </w:tcPr>
+          <w:p>
+            <w:r>
+              <w:rPr>
+                <w:b w:val="false"/>
+                <w:bCs w:val="false"/>
+                <w:sz w:val="18"/>
+                <w:szCs w:val="18"/>
+              </w:rPr>
+              <w:t xml:space="preserve">SFT</w:t>
+            </w:r>
+          </w:p>
+        </w:tc>
+        <w:tc>
+          <w:tcPr>
+            <w:tcW w:type="dxa" w:w="4513"/>
+            <w:tcBorders>
+              <w:top w:val="single" w:color="BBBBBB" w:sz="4"/>
+              <w:left w:val="single" w:color="BBBBBB" w:sz="4"/>
+              <w:bottom w:val="single" w:color="BBBBBB" w:sz="4"/>
+              <w:right w:val="single" w:color="BBBBBB" w:sz="4"/>
+            </w:tcBorders>
+            <w:tcMar>
+              <w:top w:type="dxa" w:w="60"/>
+              <w:left w:type="dxa" w:w="100"/>
+              <w:bottom w:type="dxa" w:w="60"/>
+              <w:right w:type="dxa" w:w="100"/>
+            </w:tcMar>
+          </w:tcPr>
+          <w:p>
+            <w:r>
+              <w:rPr>
+                <w:b w:val="false"/>
+                <w:bCs w:val="false"/>
+                <w:sz w:val="18"/>
+                <w:szCs w:val="18"/>
+              </w:rPr>
+              <w:t xml:space="preserve">QLoRA 4 bits (NF4, dupla quantização), LoRA r=32 nas 7 projeções de atenção e MLP, 3 épocas, 20.747 exemplos</w:t>
+            </w:r>
+          </w:p>
+        </w:tc>
+      </w:tr>
+      <w:tr>
+        <w:trPr>
+          <w:tblHeader w:val="off"/>
+        </w:trPr>
+        <w:tc>
+          <w:tcPr>
+            <w:tcW w:type="dxa" w:w="4513"/>
+            <w:tcBorders>
+              <w:top w:val="single" w:color="BBBBBB" w:sz="4"/>
+              <w:left w:val="single" w:color="BBBBBB" w:sz="4"/>
+              <w:bottom w:val="single" w:color="BBBBBB" w:sz="4"/>
+              <w:right w:val="single" w:color="BBBBBB" w:sz="4"/>
+            </w:tcBorders>
+            <w:tcMar>
+              <w:top w:type="dxa" w:w="60"/>
+              <w:left w:type="dxa" w:w="100"/>
+              <w:bottom w:type="dxa" w:w="60"/>
+              <w:right w:type="dxa" w:w="100"/>
+            </w:tcMar>
+          </w:tcPr>
+          <w:p>
+            <w:r>
+              <w:rPr>
+                <w:b w:val="false"/>
+                <w:bCs w:val="false"/>
+                <w:sz w:val="18"/>
+                <w:szCs w:val="18"/>
+              </w:rPr>
+              <w:t xml:space="preserve">Formatos</w:t>
+            </w:r>
+          </w:p>
+        </w:tc>
+        <w:tc>
+          <w:tcPr>
+            <w:tcW w:type="dxa" w:w="4513"/>
+            <w:tcBorders>
+              <w:top w:val="single" w:color="BBBBBB" w:sz="4"/>
+              <w:left w:val="single" w:color="BBBBBB" w:sz="4"/>
+              <w:bottom w:val="single" w:color="BBBBBB" w:sz="4"/>
+              <w:right w:val="single" w:color="BBBBBB" w:sz="4"/>
+            </w:tcBorders>
+            <w:tcMar>
+              <w:top w:type="dxa" w:w="60"/>
+              <w:left w:type="dxa" w:w="100"/>
+              <w:bottom w:type="dxa" w:w="60"/>
+              <w:right w:type="dxa" w:w="100"/>
+            </w:tcMar>
+          </w:tcPr>
+          <w:p>
+            <w:r>
+              <w:rPr>
+                <w:b w:val="false"/>
+                <w:bCs w:val="false"/>
+                <w:sz w:val="18"/>
+                <w:szCs w:val="18"/>
+              </w:rPr>
+              <w:t xml:space="preserve">adapter LoRA (safetensors, 134 MB) sobre o modelo do CPT (3,3 GB, bf16); GGUF F16 (3,4 GB) e Q8_0 (1,8 GB)</w:t>
+            </w:r>
+          </w:p>
+        </w:tc>
+      </w:tr>
+      <w:tr>
+        <w:trPr>
+          <w:tblHeader w:val="off"/>
+        </w:trPr>
+        <w:tc>
+          <w:tcPr>
+            <w:tcW w:type="dxa" w:w="4513"/>
+            <w:tcBorders>
+              <w:top w:val="single" w:color="BBBBBB" w:sz="4"/>
+              <w:left w:val="single" w:color="BBBBBB" w:sz="4"/>
+              <w:bottom w:val="single" w:color="BBBBBB" w:sz="4"/>
+              <w:right w:val="single" w:color="BBBBBB" w:sz="4"/>
+            </w:tcBorders>
+            <w:tcMar>
+              <w:top w:type="dxa" w:w="60"/>
+              <w:left w:type="dxa" w:w="100"/>
+              <w:bottom w:type="dxa" w:w="60"/>
+              <w:right w:type="dxa" w:w="100"/>
+            </w:tcMar>
+          </w:tcPr>
+          <w:p>
+            <w:r>
+              <w:rPr>
+                <w:b w:val="false"/>
+                <w:bCs w:val="false"/>
+                <w:sz w:val="18"/>
+                <w:szCs w:val="18"/>
+              </w:rPr>
+              <w:t xml:space="preserve">Precisão que o adapter exige</w:t>
+            </w:r>
+          </w:p>
+        </w:tc>
+        <w:tc>
+          <w:tcPr>
+            <w:tcW w:type="dxa" w:w="4513"/>
+            <w:tcBorders>
+              <w:top w:val="single" w:color="BBBBBB" w:sz="4"/>
+              <w:left w:val="single" w:color="BBBBBB" w:sz="4"/>
+              <w:bottom w:val="single" w:color="BBBBBB" w:sz="4"/>
+              <w:right w:val="single" w:color="BBBBBB" w:sz="4"/>
+            </w:tcBorders>
+            <w:tcMar>
+              <w:top w:type="dxa" w:w="60"/>
+              <w:left w:type="dxa" w:w="100"/>
+              <w:bottom w:type="dxa" w:w="60"/>
+              <w:right w:type="dxa" w:w="100"/>
+            </w:tcMar>
+          </w:tcPr>
+          <w:p>
+            <w:r>
+              <w:rPr>
+                <w:b w:val="false"/>
+                <w:bCs w:val="false"/>
+                <w:sz w:val="18"/>
+                <w:szCs w:val="18"/>
+              </w:rPr>
+              <w:t xml:space="preserve">base em NF4 (o treino); em bf16 o resultado cai; o GGUF é fundido sobre o NF4 simulado</w:t>
+            </w:r>
+          </w:p>
+        </w:tc>
+      </w:tr>
+      <w:tr>
+        <w:trPr>
+          <w:tblHeader w:val="off"/>
+        </w:trPr>
+        <w:tc>
+          <w:tcPr>
+            <w:tcW w:type="dxa" w:w="4513"/>
+            <w:tcBorders>
+              <w:top w:val="single" w:color="BBBBBB" w:sz="4"/>
+              <w:left w:val="single" w:color="BBBBBB" w:sz="4"/>
+              <w:bottom w:val="single" w:color="BBBBBB" w:sz="4"/>
+              <w:right w:val="single" w:color="BBBBBB" w:sz="4"/>
+            </w:tcBorders>
+            <w:tcMar>
+              <w:top w:type="dxa" w:w="60"/>
+              <w:left w:type="dxa" w:w="100"/>
+              <w:bottom w:type="dxa" w:w="60"/>
+              <w:right w:type="dxa" w:w="100"/>
+            </w:tcMar>
+          </w:tcPr>
+          <w:p>
+            <w:r>
+              <w:rPr>
+                <w:b w:val="false"/>
+                <w:bCs w:val="false"/>
+                <w:sz w:val="18"/>
+                <w:szCs w:val="18"/>
+              </w:rPr>
+              <w:t xml:space="preserve">Velocidade medida</w:t>
+            </w:r>
+          </w:p>
+        </w:tc>
+        <w:tc>
+          <w:tcPr>
+            <w:tcW w:type="dxa" w:w="4513"/>
+            <w:tcBorders>
+              <w:top w:val="single" w:color="BBBBBB" w:sz="4"/>
+              <w:left w:val="single" w:color="BBBBBB" w:sz="4"/>
+              <w:bottom w:val="single" w:color="BBBBBB" w:sz="4"/>
+              <w:right w:val="single" w:color="BBBBBB" w:sz="4"/>
+            </w:tcBorders>
+            <w:tcMar>
+              <w:top w:type="dxa" w:w="60"/>
+              <w:left w:type="dxa" w:w="100"/>
+              <w:bottom w:type="dxa" w:w="60"/>
+              <w:right w:type="dxa" w:w="100"/>
+            </w:tcMar>
+          </w:tcPr>
+          <w:p>
+            <w:r>
+              <w:rPr>
+                <w:b w:val="false"/>
+                <w:bCs w:val="false"/>
+                <w:sz w:val="18"/>
+                <w:szCs w:val="18"/>
+              </w:rPr>
+              <w:t xml:space="preserve">cerca de 15 tokens por segundo (Q8_0, GPU Intel Arc, llama.cpp SYCL); cerca de 45 s por arquivo FastAPI</w:t>
+            </w:r>
+          </w:p>
+        </w:tc>
+      </w:tr>
+      <w:tr>
+        <w:trPr>
+          <w:tblHeader w:val="off"/>
+        </w:trPr>
+        <w:tc>
+          <w:tcPr>
+            <w:tcW w:type="dxa" w:w="4513"/>
+            <w:tcBorders>
+              <w:top w:val="single" w:color="BBBBBB" w:sz="4"/>
+              <w:left w:val="single" w:color="BBBBBB" w:sz="4"/>
+              <w:bottom w:val="single" w:color="BBBBBB" w:sz="4"/>
+              <w:right w:val="single" w:color="BBBBBB" w:sz="4"/>
+            </w:tcBorders>
+            <w:tcMar>
+              <w:top w:type="dxa" w:w="60"/>
+              <w:left w:type="dxa" w:w="100"/>
+              <w:bottom w:type="dxa" w:w="60"/>
+              <w:right w:type="dxa" w:w="100"/>
+            </w:tcMar>
+          </w:tcPr>
+          <w:p>
+            <w:r>
+              <w:rPr>
+                <w:b w:val="false"/>
+                <w:bCs w:val="false"/>
+                <w:sz w:val="18"/>
+                <w:szCs w:val="18"/>
+              </w:rPr>
+              <w:t xml:space="preserve">Geração usada nos testes</w:t>
+            </w:r>
+          </w:p>
+        </w:tc>
+        <w:tc>
+          <w:tcPr>
+            <w:tcW w:type="dxa" w:w="4513"/>
+            <w:tcBorders>
+              <w:top w:val="single" w:color="BBBBBB" w:sz="4"/>
+              <w:left w:val="single" w:color="BBBBBB" w:sz="4"/>
+              <w:bottom w:val="single" w:color="BBBBBB" w:sz="4"/>
+              <w:right w:val="single" w:color="BBBBBB" w:sz="4"/>
+            </w:tcBorders>
+            <w:tcMar>
+              <w:top w:type="dxa" w:w="60"/>
+              <w:left w:type="dxa" w:w="100"/>
+              <w:bottom w:type="dxa" w:w="60"/>
+              <w:right w:type="dxa" w:w="100"/>
+            </w:tcMar>
+          </w:tcPr>
+          <w:p>
+            <w:r>
+              <w:rPr>
+                <w:b w:val="false"/>
+                <w:bCs w:val="false"/>
+                <w:sz w:val="18"/>
+                <w:szCs w:val="18"/>
+              </w:rPr>
+              <w:t xml:space="preserve">greedy (temperatura 0)</w:t>
+            </w:r>
+          </w:p>
+        </w:tc>
+      </w:tr>
+      <w:tr>
+        <w:trPr>
+          <w:tblHeader w:val="off"/>
+        </w:trPr>
+        <w:tc>
+          <w:tcPr>
+            <w:tcW w:type="dxa" w:w="4513"/>
+            <w:tcBorders>
+              <w:top w:val="single" w:color="BBBBBB" w:sz="4"/>
+              <w:left w:val="single" w:color="BBBBBB" w:sz="4"/>
+              <w:bottom w:val="single" w:color="BBBBBB" w:sz="4"/>
+              <w:right w:val="single" w:color="BBBBBB" w:sz="4"/>
+            </w:tcBorders>
+            <w:tcMar>
+              <w:top w:type="dxa" w:w="60"/>
+              <w:left w:type="dxa" w:w="100"/>
+              <w:bottom w:type="dxa" w:w="60"/>
+              <w:right w:type="dxa" w:w="100"/>
+            </w:tcMar>
+          </w:tcPr>
+          <w:p>
+            <w:r>
+              <w:rPr>
+                <w:b w:val="false"/>
+                <w:bCs w:val="false"/>
+                <w:sz w:val="18"/>
+                <w:szCs w:val="18"/>
+              </w:rPr>
+              <w:t xml:space="preserve">Licença</w:t>
+            </w:r>
+          </w:p>
+        </w:tc>
+        <w:tc>
+          <w:tcPr>
+            <w:tcW w:type="dxa" w:w="4513"/>
+            <w:tcBorders>
+              <w:top w:val="single" w:color="BBBBBB" w:sz="4"/>
+              <w:left w:val="single" w:color="BBBBBB" w:sz="4"/>
+              <w:bottom w:val="single" w:color="BBBBBB" w:sz="4"/>
+              <w:right w:val="single" w:color="BBBBBB" w:sz="4"/>
+            </w:tcBorders>
+            <w:tcMar>
+              <w:top w:type="dxa" w:w="60"/>
+              <w:left w:type="dxa" w:w="100"/>
+              <w:bottom w:type="dxa" w:w="60"/>
+              <w:right w:type="dxa" w:w="100"/>
+            </w:tcMar>
+          </w:tcPr>
+          <w:p>
+            <w:r>
+              <w:rPr>
+                <w:b w:val="false"/>
+                <w:bCs w:val="false"/>
+                <w:sz w:val="18"/>
+                <w:szCs w:val="18"/>
+              </w:rPr>
+              <w:t xml:space="preserve">não comercial (herdada do Alpaca-PT e do XLSum, como o Manacá-1B-Instruct)</w:t>
+            </w:r>
+          </w:p>
+        </w:tc>
+      </w:tr>
+    </w:tbl>
+    <w:p/>
     <w:p>
       <w:pPr>
         <w:pStyle w:val="Heading1"/>
@@ -1184,6 +2641,1052 @@
         <w:pStyle w:val="Heading1"/>
       </w:pPr>
       <w:r>
+        <w:t xml:space="preserve">Benchmark e comparação com outros modelos</w:t>
+      </w:r>
+    </w:p>
+    <w:p>
+      <w:pPr>
+        <w:spacing w:after="120"/>
+      </w:pPr>
+      <w:r>
+        <w:t xml:space="preserve">O benchmark mede duas coisas, com o mesmo código para qualquer modelo:</w:t>
+      </w:r>
+    </w:p>
+    <w:p>
+      <w:pPr>
+        <w:pStyle w:val="ListParagraph"/>
+        <w:numPr>
+          <w:ilvl w:val="0"/>
+          <w:numId w:val="2"/>
+        </w:numPr>
+      </w:pPr>
+      <w:r>
+        <w:rPr>
+          <w:b/>
+          <w:bCs/>
+        </w:rPr>
+        <w:t xml:space="preserve">FastAPI:</w:t>
+      </w:r>
+      <w:r>
+        <w:t xml:space="preserve"> 182 pedidos sobre 12 entidades que nunca aparecem no treino (</w:t>
+      </w:r>
+      <w:r>
+        <w:rPr>
+          <w:rFonts w:ascii="Consolas" w:cs="Consolas" w:eastAsia="Consolas" w:hAnsi="Consolas"/>
+        </w:rPr>
+        <w:t xml:space="preserve">data/fastapi_ptbr_teste_amplo.jsonl</w:t>
+      </w:r>
+      <w:r>
+        <w:t xml:space="preserve">). Para cada resposta, </w:t>
+      </w:r>
+      <w:r>
+        <w:rPr>
+          <w:rFonts w:ascii="Consolas" w:cs="Consolas" w:eastAsia="Consolas" w:hAnsi="Consolas"/>
+        </w:rPr>
+        <w:t xml:space="preserve">scripts/eval_code.py</w:t>
+      </w:r>
+      <w:r>
+        <w:t xml:space="preserve"> confere se compila, sobe o app numa sandbox e roda o CRUD, e confere o nome da classe do model SQLAlchemy.</w:t>
+      </w:r>
+    </w:p>
+    <w:p>
+      <w:pPr>
+        <w:pStyle w:val="ListParagraph"/>
+        <w:numPr>
+          <w:ilvl w:val="0"/>
+          <w:numId w:val="2"/>
+        </w:numPr>
+      </w:pPr>
+      <w:r>
+        <w:rPr>
+          <w:b/>
+          <w:bCs/>
+        </w:rPr>
+        <w:t xml:space="preserve">Conversa:</w:t>
+      </w:r>
+      <w:r>
+        <w:t xml:space="preserve"> 18 pedidos gerais (</w:t>
+      </w:r>
+      <w:r>
+        <w:rPr>
+          <w:rFonts w:ascii="Consolas" w:cs="Consolas" w:eastAsia="Consolas" w:hAnsi="Consolas"/>
+        </w:rPr>
+        <w:t xml:space="preserve">scripts/eval_conversa.py</w:t>
+      </w:r>
+      <w:r>
+        <w:t xml:space="preserve">). Conta quantas respostas saem em texto, e não como um arquivo FastAPI, e guarda as respostas para leitura.</w:t>
+      </w:r>
+    </w:p>
+    <w:p>
+      <w:pPr>
+        <w:spacing w:after="120"/>
+      </w:pPr>
+      <w:r>
+        <w:t xml:space="preserve">Todo modelo passa pelo mesmo SFT (QLoRA 4 bits, LoRA r=32, 3 épocas, os mesmos dados), e a geração é greedy, sobre o modelo base em 4 bits, como no treino.</w:t>
+      </w:r>
+    </w:p>
+    <w:p>
+      <w:pPr>
+        <w:spacing w:after="120"/>
+      </w:pPr>
+      <w:r>
+        <w:t xml:space="preserve">### O benchmark com o Qwen</w:t>
+      </w:r>
+    </w:p>
+    <w:p>
+      <w:pPr>
+        <w:spacing w:after="120"/>
+      </w:pPr>
+      <w:r>
+        <w:t xml:space="preserve">O controle foi o </w:t>
+      </w:r>
+      <w:hyperlink w:history="1" r:id="rIdoykb0pimut2da4c5rhmz8">
+        <w:r>
+          <w:rPr>
+            <w:rStyle w:val="Hyperlink"/>
+          </w:rPr>
+          <w:t xml:space="preserve">Qwen2.5-0.5B</w:t>
+        </w:r>
+      </w:hyperlink>
+      <w:r>
+        <w:t xml:space="preserve"> base, com metade do tamanho do Manacá, treinado só com os 7.932 pedidos de FastAPI no template antigo. Levou 54 minutos de SFT na RTX 3090. Para reproduzir:</w:t>
+      </w:r>
+    </w:p>
+    <w:p>
+      <w:r>
+        <w:rPr>
+          <w:rFonts w:ascii="Consolas" w:cs="Consolas" w:eastAsia="Consolas" w:hAnsi="Consolas"/>
+          <w:sz w:val="18"/>
+          <w:szCs w:val="18"/>
+        </w:rPr>
+        <w:t xml:space="preserve">MODO=fastapi scripts/comparar_modelo_3090.sh Qwen/Qwen2.5-0.5B qwen05-fastapi</w:t>
+      </w:r>
+    </w:p>
+    <w:tbl>
+      <w:tblPr>
+        <w:tblW w:type="dxa" w:w="9025"/>
+        <w:tblBorders>
+          <w:top w:val="single" w:color="auto" w:sz="4"/>
+          <w:left w:val="single" w:color="auto" w:sz="4"/>
+          <w:bottom w:val="single" w:color="auto" w:sz="4"/>
+          <w:right w:val="single" w:color="auto" w:sz="4"/>
+          <w:insideH w:val="single" w:color="auto" w:sz="4"/>
+          <w:insideV w:val="single" w:color="auto" w:sz="4"/>
+        </w:tblBorders>
+      </w:tblPr>
+      <w:tblGrid>
+        <w:gridCol w:w="1805"/>
+        <w:gridCol w:w="1805"/>
+        <w:gridCol w:w="1805"/>
+        <w:gridCol w:w="1805"/>
+        <w:gridCol w:w="1805"/>
+      </w:tblGrid>
+      <w:tr>
+        <w:trPr>
+          <w:tblHeader/>
+        </w:trPr>
+        <w:tc>
+          <w:tcPr>
+            <w:tcW w:type="dxa" w:w="1805"/>
+            <w:tcBorders>
+              <w:top w:val="single" w:color="BBBBBB" w:sz="4"/>
+              <w:left w:val="single" w:color="BBBBBB" w:sz="4"/>
+              <w:bottom w:val="single" w:color="BBBBBB" w:sz="4"/>
+              <w:right w:val="single" w:color="BBBBBB" w:sz="4"/>
+            </w:tcBorders>
+            <w:shd w:fill="E8EEF4" w:val="clear"/>
+            <w:tcMar>
+              <w:top w:type="dxa" w:w="60"/>
+              <w:left w:type="dxa" w:w="100"/>
+              <w:bottom w:type="dxa" w:w="60"/>
+              <w:right w:type="dxa" w:w="100"/>
+            </w:tcMar>
+          </w:tcPr>
+          <w:p>
+            <w:r>
+              <w:rPr>
+                <w:b/>
+                <w:bCs/>
+                <w:sz w:val="18"/>
+                <w:szCs w:val="18"/>
+              </w:rPr>
+              <w:t xml:space="preserve">Modelo</w:t>
+            </w:r>
+          </w:p>
+        </w:tc>
+        <w:tc>
+          <w:tcPr>
+            <w:tcW w:type="dxa" w:w="1805"/>
+            <w:tcBorders>
+              <w:top w:val="single" w:color="BBBBBB" w:sz="4"/>
+              <w:left w:val="single" w:color="BBBBBB" w:sz="4"/>
+              <w:bottom w:val="single" w:color="BBBBBB" w:sz="4"/>
+              <w:right w:val="single" w:color="BBBBBB" w:sz="4"/>
+            </w:tcBorders>
+            <w:shd w:fill="E8EEF4" w:val="clear"/>
+            <w:tcMar>
+              <w:top w:type="dxa" w:w="60"/>
+              <w:left w:type="dxa" w:w="100"/>
+              <w:bottom w:type="dxa" w:w="60"/>
+              <w:right w:type="dxa" w:w="100"/>
+            </w:tcMar>
+          </w:tcPr>
+          <w:p>
+            <w:r>
+              <w:rPr>
+                <w:b/>
+                <w:bCs/>
+                <w:sz w:val="18"/>
+                <w:szCs w:val="18"/>
+              </w:rPr>
+              <w:t xml:space="preserve">Nome da classe</w:t>
+            </w:r>
+          </w:p>
+        </w:tc>
+        <w:tc>
+          <w:tcPr>
+            <w:tcW w:type="dxa" w:w="1805"/>
+            <w:tcBorders>
+              <w:top w:val="single" w:color="BBBBBB" w:sz="4"/>
+              <w:left w:val="single" w:color="BBBBBB" w:sz="4"/>
+              <w:bottom w:val="single" w:color="BBBBBB" w:sz="4"/>
+              <w:right w:val="single" w:color="BBBBBB" w:sz="4"/>
+            </w:tcBorders>
+            <w:shd w:fill="E8EEF4" w:val="clear"/>
+            <w:tcMar>
+              <w:top w:type="dxa" w:w="60"/>
+              <w:left w:type="dxa" w:w="100"/>
+              <w:bottom w:type="dxa" w:w="60"/>
+              <w:right w:type="dxa" w:w="100"/>
+            </w:tcMar>
+          </w:tcPr>
+          <w:p>
+            <w:r>
+              <w:rPr>
+                <w:b/>
+                <w:bCs/>
+                <w:sz w:val="18"/>
+                <w:szCs w:val="18"/>
+              </w:rPr>
+              <w:t xml:space="preserve">Compila</w:t>
+            </w:r>
+          </w:p>
+        </w:tc>
+        <w:tc>
+          <w:tcPr>
+            <w:tcW w:type="dxa" w:w="1805"/>
+            <w:tcBorders>
+              <w:top w:val="single" w:color="BBBBBB" w:sz="4"/>
+              <w:left w:val="single" w:color="BBBBBB" w:sz="4"/>
+              <w:bottom w:val="single" w:color="BBBBBB" w:sz="4"/>
+              <w:right w:val="single" w:color="BBBBBB" w:sz="4"/>
+            </w:tcBorders>
+            <w:shd w:fill="E8EEF4" w:val="clear"/>
+            <w:tcMar>
+              <w:top w:type="dxa" w:w="60"/>
+              <w:left w:type="dxa" w:w="100"/>
+              <w:bottom w:type="dxa" w:w="60"/>
+              <w:right w:type="dxa" w:w="100"/>
+            </w:tcMar>
+          </w:tcPr>
+          <w:p>
+            <w:r>
+              <w:rPr>
+                <w:b/>
+                <w:bCs/>
+                <w:sz w:val="18"/>
+                <w:szCs w:val="18"/>
+              </w:rPr>
+              <w:t xml:space="preserve">App sobe e responde</w:t>
+            </w:r>
+          </w:p>
+        </w:tc>
+        <w:tc>
+          <w:tcPr>
+            <w:tcW w:type="dxa" w:w="1805"/>
+            <w:tcBorders>
+              <w:top w:val="single" w:color="BBBBBB" w:sz="4"/>
+              <w:left w:val="single" w:color="BBBBBB" w:sz="4"/>
+              <w:bottom w:val="single" w:color="BBBBBB" w:sz="4"/>
+              <w:right w:val="single" w:color="BBBBBB" w:sz="4"/>
+            </w:tcBorders>
+            <w:shd w:fill="E8EEF4" w:val="clear"/>
+            <w:tcMar>
+              <w:top w:type="dxa" w:w="60"/>
+              <w:left w:type="dxa" w:w="100"/>
+              <w:bottom w:type="dxa" w:w="60"/>
+              <w:right w:type="dxa" w:w="100"/>
+            </w:tcMar>
+          </w:tcPr>
+          <w:p>
+            <w:r>
+              <w:rPr>
+                <w:b/>
+                <w:bCs/>
+                <w:sz w:val="18"/>
+                <w:szCs w:val="18"/>
+              </w:rPr>
+              <w:t xml:space="preserve">Conversa</w:t>
+            </w:r>
+          </w:p>
+        </w:tc>
+      </w:tr>
+      <w:tr>
+        <w:trPr>
+          <w:tblHeader w:val="off"/>
+        </w:trPr>
+        <w:tc>
+          <w:tcPr>
+            <w:tcW w:type="dxa" w:w="1805"/>
+            <w:tcBorders>
+              <w:top w:val="single" w:color="BBBBBB" w:sz="4"/>
+              <w:left w:val="single" w:color="BBBBBB" w:sz="4"/>
+              <w:bottom w:val="single" w:color="BBBBBB" w:sz="4"/>
+              <w:right w:val="single" w:color="BBBBBB" w:sz="4"/>
+            </w:tcBorders>
+            <w:tcMar>
+              <w:top w:type="dxa" w:w="60"/>
+              <w:left w:type="dxa" w:w="100"/>
+              <w:bottom w:type="dxa" w:w="60"/>
+              <w:right w:type="dxa" w:w="100"/>
+            </w:tcMar>
+          </w:tcPr>
+          <w:p>
+            <w:r>
+              <w:rPr>
+                <w:b w:val="false"/>
+                <w:bCs w:val="false"/>
+                <w:sz w:val="18"/>
+                <w:szCs w:val="18"/>
+              </w:rPr>
+              <w:t xml:space="preserve">Qwen2.5-0.5B, só FastAPI</w:t>
+            </w:r>
+          </w:p>
+        </w:tc>
+        <w:tc>
+          <w:tcPr>
+            <w:tcW w:type="dxa" w:w="1805"/>
+            <w:tcBorders>
+              <w:top w:val="single" w:color="BBBBBB" w:sz="4"/>
+              <w:left w:val="single" w:color="BBBBBB" w:sz="4"/>
+              <w:bottom w:val="single" w:color="BBBBBB" w:sz="4"/>
+              <w:right w:val="single" w:color="BBBBBB" w:sz="4"/>
+            </w:tcBorders>
+            <w:tcMar>
+              <w:top w:type="dxa" w:w="60"/>
+              <w:left w:type="dxa" w:w="100"/>
+              <w:bottom w:type="dxa" w:w="60"/>
+              <w:right w:type="dxa" w:w="100"/>
+            </w:tcMar>
+          </w:tcPr>
+          <w:p>
+            <w:r>
+              <w:rPr>
+                <w:b w:val="false"/>
+                <w:bCs w:val="false"/>
+                <w:sz w:val="18"/>
+                <w:szCs w:val="18"/>
+              </w:rPr>
+              <w:t xml:space="preserve">100%</w:t>
+            </w:r>
+          </w:p>
+        </w:tc>
+        <w:tc>
+          <w:tcPr>
+            <w:tcW w:type="dxa" w:w="1805"/>
+            <w:tcBorders>
+              <w:top w:val="single" w:color="BBBBBB" w:sz="4"/>
+              <w:left w:val="single" w:color="BBBBBB" w:sz="4"/>
+              <w:bottom w:val="single" w:color="BBBBBB" w:sz="4"/>
+              <w:right w:val="single" w:color="BBBBBB" w:sz="4"/>
+            </w:tcBorders>
+            <w:tcMar>
+              <w:top w:type="dxa" w:w="60"/>
+              <w:left w:type="dxa" w:w="100"/>
+              <w:bottom w:type="dxa" w:w="60"/>
+              <w:right w:type="dxa" w:w="100"/>
+            </w:tcMar>
+          </w:tcPr>
+          <w:p>
+            <w:r>
+              <w:rPr>
+                <w:b w:val="false"/>
+                <w:bCs w:val="false"/>
+                <w:sz w:val="18"/>
+                <w:szCs w:val="18"/>
+              </w:rPr>
+              <w:t xml:space="preserve">100%</w:t>
+            </w:r>
+          </w:p>
+        </w:tc>
+        <w:tc>
+          <w:tcPr>
+            <w:tcW w:type="dxa" w:w="1805"/>
+            <w:tcBorders>
+              <w:top w:val="single" w:color="BBBBBB" w:sz="4"/>
+              <w:left w:val="single" w:color="BBBBBB" w:sz="4"/>
+              <w:bottom w:val="single" w:color="BBBBBB" w:sz="4"/>
+              <w:right w:val="single" w:color="BBBBBB" w:sz="4"/>
+            </w:tcBorders>
+            <w:tcMar>
+              <w:top w:type="dxa" w:w="60"/>
+              <w:left w:type="dxa" w:w="100"/>
+              <w:bottom w:type="dxa" w:w="60"/>
+              <w:right w:type="dxa" w:w="100"/>
+            </w:tcMar>
+          </w:tcPr>
+          <w:p>
+            <w:r>
+              <w:rPr>
+                <w:b w:val="false"/>
+                <w:bCs w:val="false"/>
+                <w:sz w:val="18"/>
+                <w:szCs w:val="18"/>
+              </w:rPr>
+              <w:t xml:space="preserve">100%</w:t>
+            </w:r>
+          </w:p>
+        </w:tc>
+        <w:tc>
+          <w:tcPr>
+            <w:tcW w:type="dxa" w:w="1805"/>
+            <w:tcBorders>
+              <w:top w:val="single" w:color="BBBBBB" w:sz="4"/>
+              <w:left w:val="single" w:color="BBBBBB" w:sz="4"/>
+              <w:bottom w:val="single" w:color="BBBBBB" w:sz="4"/>
+              <w:right w:val="single" w:color="BBBBBB" w:sz="4"/>
+            </w:tcBorders>
+            <w:tcMar>
+              <w:top w:type="dxa" w:w="60"/>
+              <w:left w:type="dxa" w:w="100"/>
+              <w:bottom w:type="dxa" w:w="60"/>
+              <w:right w:type="dxa" w:w="100"/>
+            </w:tcMar>
+          </w:tcPr>
+          <w:p>
+            <w:r>
+              <w:rPr>
+                <w:b w:val="false"/>
+                <w:bCs w:val="false"/>
+                <w:sz w:val="18"/>
+                <w:szCs w:val="18"/>
+              </w:rPr>
+              <w:t xml:space="preserve">não medida</w:t>
+            </w:r>
+          </w:p>
+        </w:tc>
+      </w:tr>
+      <w:tr>
+        <w:trPr>
+          <w:tblHeader w:val="off"/>
+        </w:trPr>
+        <w:tc>
+          <w:tcPr>
+            <w:tcW w:type="dxa" w:w="1805"/>
+            <w:tcBorders>
+              <w:top w:val="single" w:color="BBBBBB" w:sz="4"/>
+              <w:left w:val="single" w:color="BBBBBB" w:sz="4"/>
+              <w:bottom w:val="single" w:color="BBBBBB" w:sz="4"/>
+              <w:right w:val="single" w:color="BBBBBB" w:sz="4"/>
+            </w:tcBorders>
+            <w:tcMar>
+              <w:top w:type="dxa" w:w="60"/>
+              <w:left w:type="dxa" w:w="100"/>
+              <w:bottom w:type="dxa" w:w="60"/>
+              <w:right w:type="dxa" w:w="100"/>
+            </w:tcMar>
+          </w:tcPr>
+          <w:p>
+            <w:r>
+              <w:rPr>
+                <w:b w:val="false"/>
+                <w:bCs w:val="false"/>
+                <w:sz w:val="18"/>
+                <w:szCs w:val="18"/>
+              </w:rPr>
+              <w:t xml:space="preserve">Manacá v4, só FastAPI</w:t>
+            </w:r>
+          </w:p>
+        </w:tc>
+        <w:tc>
+          <w:tcPr>
+            <w:tcW w:type="dxa" w:w="1805"/>
+            <w:tcBorders>
+              <w:top w:val="single" w:color="BBBBBB" w:sz="4"/>
+              <w:left w:val="single" w:color="BBBBBB" w:sz="4"/>
+              <w:bottom w:val="single" w:color="BBBBBB" w:sz="4"/>
+              <w:right w:val="single" w:color="BBBBBB" w:sz="4"/>
+            </w:tcBorders>
+            <w:tcMar>
+              <w:top w:type="dxa" w:w="60"/>
+              <w:left w:type="dxa" w:w="100"/>
+              <w:bottom w:type="dxa" w:w="60"/>
+              <w:right w:type="dxa" w:w="100"/>
+            </w:tcMar>
+          </w:tcPr>
+          <w:p>
+            <w:r>
+              <w:rPr>
+                <w:b w:val="false"/>
+                <w:bCs w:val="false"/>
+                <w:sz w:val="18"/>
+                <w:szCs w:val="18"/>
+              </w:rPr>
+              <w:t xml:space="preserve">100%</w:t>
+            </w:r>
+          </w:p>
+        </w:tc>
+        <w:tc>
+          <w:tcPr>
+            <w:tcW w:type="dxa" w:w="1805"/>
+            <w:tcBorders>
+              <w:top w:val="single" w:color="BBBBBB" w:sz="4"/>
+              <w:left w:val="single" w:color="BBBBBB" w:sz="4"/>
+              <w:bottom w:val="single" w:color="BBBBBB" w:sz="4"/>
+              <w:right w:val="single" w:color="BBBBBB" w:sz="4"/>
+            </w:tcBorders>
+            <w:tcMar>
+              <w:top w:type="dxa" w:w="60"/>
+              <w:left w:type="dxa" w:w="100"/>
+              <w:bottom w:type="dxa" w:w="60"/>
+              <w:right w:type="dxa" w:w="100"/>
+            </w:tcMar>
+          </w:tcPr>
+          <w:p>
+            <w:r>
+              <w:rPr>
+                <w:b w:val="false"/>
+                <w:bCs w:val="false"/>
+                <w:sz w:val="18"/>
+                <w:szCs w:val="18"/>
+              </w:rPr>
+              <w:t xml:space="preserve">100%</w:t>
+            </w:r>
+          </w:p>
+        </w:tc>
+        <w:tc>
+          <w:tcPr>
+            <w:tcW w:type="dxa" w:w="1805"/>
+            <w:tcBorders>
+              <w:top w:val="single" w:color="BBBBBB" w:sz="4"/>
+              <w:left w:val="single" w:color="BBBBBB" w:sz="4"/>
+              <w:bottom w:val="single" w:color="BBBBBB" w:sz="4"/>
+              <w:right w:val="single" w:color="BBBBBB" w:sz="4"/>
+            </w:tcBorders>
+            <w:tcMar>
+              <w:top w:type="dxa" w:w="60"/>
+              <w:left w:type="dxa" w:w="100"/>
+              <w:bottom w:type="dxa" w:w="60"/>
+              <w:right w:type="dxa" w:w="100"/>
+            </w:tcMar>
+          </w:tcPr>
+          <w:p>
+            <w:r>
+              <w:rPr>
+                <w:b w:val="false"/>
+                <w:bCs w:val="false"/>
+                <w:sz w:val="18"/>
+                <w:szCs w:val="18"/>
+              </w:rPr>
+              <w:t xml:space="preserve">100%</w:t>
+            </w:r>
+          </w:p>
+        </w:tc>
+        <w:tc>
+          <w:tcPr>
+            <w:tcW w:type="dxa" w:w="1805"/>
+            <w:tcBorders>
+              <w:top w:val="single" w:color="BBBBBB" w:sz="4"/>
+              <w:left w:val="single" w:color="BBBBBB" w:sz="4"/>
+              <w:bottom w:val="single" w:color="BBBBBB" w:sz="4"/>
+              <w:right w:val="single" w:color="BBBBBB" w:sz="4"/>
+            </w:tcBorders>
+            <w:tcMar>
+              <w:top w:type="dxa" w:w="60"/>
+              <w:left w:type="dxa" w:w="100"/>
+              <w:bottom w:type="dxa" w:w="60"/>
+              <w:right w:type="dxa" w:w="100"/>
+            </w:tcMar>
+          </w:tcPr>
+          <w:p>
+            <w:r>
+              <w:rPr>
+                <w:b w:val="false"/>
+                <w:bCs w:val="false"/>
+                <w:sz w:val="18"/>
+                <w:szCs w:val="18"/>
+              </w:rPr>
+              <w:t xml:space="preserve">"oi" vira código</w:t>
+            </w:r>
+          </w:p>
+        </w:tc>
+      </w:tr>
+      <w:tr>
+        <w:trPr>
+          <w:tblHeader w:val="off"/>
+        </w:trPr>
+        <w:tc>
+          <w:tcPr>
+            <w:tcW w:type="dxa" w:w="1805"/>
+            <w:tcBorders>
+              <w:top w:val="single" w:color="BBBBBB" w:sz="4"/>
+              <w:left w:val="single" w:color="BBBBBB" w:sz="4"/>
+              <w:bottom w:val="single" w:color="BBBBBB" w:sz="4"/>
+              <w:right w:val="single" w:color="BBBBBB" w:sz="4"/>
+            </w:tcBorders>
+            <w:tcMar>
+              <w:top w:type="dxa" w:w="60"/>
+              <w:left w:type="dxa" w:w="100"/>
+              <w:bottom w:type="dxa" w:w="60"/>
+              <w:right w:type="dxa" w:w="100"/>
+            </w:tcMar>
+          </w:tcPr>
+          <w:p>
+            <w:r>
+              <w:rPr>
+                <w:b w:val="false"/>
+                <w:bCs w:val="false"/>
+                <w:sz w:val="18"/>
+                <w:szCs w:val="18"/>
+              </w:rPr>
+              <w:t xml:space="preserve">Manacá v4 instruct (entregue)</w:t>
+            </w:r>
+          </w:p>
+        </w:tc>
+        <w:tc>
+          <w:tcPr>
+            <w:tcW w:type="dxa" w:w="1805"/>
+            <w:tcBorders>
+              <w:top w:val="single" w:color="BBBBBB" w:sz="4"/>
+              <w:left w:val="single" w:color="BBBBBB" w:sz="4"/>
+              <w:bottom w:val="single" w:color="BBBBBB" w:sz="4"/>
+              <w:right w:val="single" w:color="BBBBBB" w:sz="4"/>
+            </w:tcBorders>
+            <w:tcMar>
+              <w:top w:type="dxa" w:w="60"/>
+              <w:left w:type="dxa" w:w="100"/>
+              <w:bottom w:type="dxa" w:w="60"/>
+              <w:right w:type="dxa" w:w="100"/>
+            </w:tcMar>
+          </w:tcPr>
+          <w:p>
+            <w:r>
+              <w:rPr>
+                <w:b w:val="false"/>
+                <w:bCs w:val="false"/>
+                <w:sz w:val="18"/>
+                <w:szCs w:val="18"/>
+              </w:rPr>
+              <w:t xml:space="preserve">97,8%</w:t>
+            </w:r>
+          </w:p>
+        </w:tc>
+        <w:tc>
+          <w:tcPr>
+            <w:tcW w:type="dxa" w:w="1805"/>
+            <w:tcBorders>
+              <w:top w:val="single" w:color="BBBBBB" w:sz="4"/>
+              <w:left w:val="single" w:color="BBBBBB" w:sz="4"/>
+              <w:bottom w:val="single" w:color="BBBBBB" w:sz="4"/>
+              <w:right w:val="single" w:color="BBBBBB" w:sz="4"/>
+            </w:tcBorders>
+            <w:tcMar>
+              <w:top w:type="dxa" w:w="60"/>
+              <w:left w:type="dxa" w:w="100"/>
+              <w:bottom w:type="dxa" w:w="60"/>
+              <w:right w:type="dxa" w:w="100"/>
+            </w:tcMar>
+          </w:tcPr>
+          <w:p>
+            <w:r>
+              <w:rPr>
+                <w:b w:val="false"/>
+                <w:bCs w:val="false"/>
+                <w:sz w:val="18"/>
+                <w:szCs w:val="18"/>
+              </w:rPr>
+              <w:t xml:space="preserve">100%</w:t>
+            </w:r>
+          </w:p>
+        </w:tc>
+        <w:tc>
+          <w:tcPr>
+            <w:tcW w:type="dxa" w:w="1805"/>
+            <w:tcBorders>
+              <w:top w:val="single" w:color="BBBBBB" w:sz="4"/>
+              <w:left w:val="single" w:color="BBBBBB" w:sz="4"/>
+              <w:bottom w:val="single" w:color="BBBBBB" w:sz="4"/>
+              <w:right w:val="single" w:color="BBBBBB" w:sz="4"/>
+            </w:tcBorders>
+            <w:tcMar>
+              <w:top w:type="dxa" w:w="60"/>
+              <w:left w:type="dxa" w:w="100"/>
+              <w:bottom w:type="dxa" w:w="60"/>
+              <w:right w:type="dxa" w:w="100"/>
+            </w:tcMar>
+          </w:tcPr>
+          <w:p>
+            <w:r>
+              <w:rPr>
+                <w:b w:val="false"/>
+                <w:bCs w:val="false"/>
+                <w:sz w:val="18"/>
+                <w:szCs w:val="18"/>
+              </w:rPr>
+              <w:t xml:space="preserve">100%</w:t>
+            </w:r>
+          </w:p>
+        </w:tc>
+        <w:tc>
+          <w:tcPr>
+            <w:tcW w:type="dxa" w:w="1805"/>
+            <w:tcBorders>
+              <w:top w:val="single" w:color="BBBBBB" w:sz="4"/>
+              <w:left w:val="single" w:color="BBBBBB" w:sz="4"/>
+              <w:bottom w:val="single" w:color="BBBBBB" w:sz="4"/>
+              <w:right w:val="single" w:color="BBBBBB" w:sz="4"/>
+            </w:tcBorders>
+            <w:tcMar>
+              <w:top w:type="dxa" w:w="60"/>
+              <w:left w:type="dxa" w:w="100"/>
+              <w:bottom w:type="dxa" w:w="60"/>
+              <w:right w:type="dxa" w:w="100"/>
+            </w:tcMar>
+          </w:tcPr>
+          <w:p>
+            <w:r>
+              <w:rPr>
+                <w:b w:val="false"/>
+                <w:bCs w:val="false"/>
+                <w:sz w:val="18"/>
+                <w:szCs w:val="18"/>
+              </w:rPr>
+              <w:t xml:space="preserve">18 de 18 em texto</w:t>
+            </w:r>
+          </w:p>
+        </w:tc>
+      </w:tr>
+    </w:tbl>
+    <w:p/>
+    <w:p>
+      <w:pPr>
+        <w:spacing w:after="120"/>
+      </w:pPr>
+      <w:r>
+        <w:t xml:space="preserve">Ele serviu para separar o problema: um modelo que já sabe maiúscula aprende a tarefa só com o SFT, então o limite estava no pré-treino do Manacá, e não nos dados nem na avaliação.</w:t>
+      </w:r>
+    </w:p>
+    <w:p>
+      <w:pPr>
+        <w:spacing w:after="120"/>
+      </w:pPr>
+      <w:r>
+        <w:t xml:space="preserve">### Rodar com outro modelo</w:t>
+      </w:r>
+    </w:p>
+    <w:p>
+      <w:pPr>
+        <w:spacing w:after="120"/>
+      </w:pPr>
+      <w:r>
+        <w:t xml:space="preserve">Na RTX 3090, com o projeto sincronizado (</w:t>
+      </w:r>
+      <w:r>
+        <w:rPr>
+          <w:rFonts w:ascii="Consolas" w:cs="Consolas" w:eastAsia="Consolas" w:hAnsi="Consolas"/>
+        </w:rPr>
+        <w:t xml:space="preserve">scripts/sync_3090.sh</w:t>
+      </w:r>
+      <w:r>
+        <w:t xml:space="preserve">):</w:t>
+      </w:r>
+    </w:p>
+    <w:p>
+      <w:r>
+        <w:rPr>
+          <w:rFonts w:ascii="Consolas" w:cs="Consolas" w:eastAsia="Consolas" w:hAnsi="Consolas"/>
+          <w:sz w:val="18"/>
+          <w:szCs w:val="18"/>
+        </w:rPr>
+        <w:t xml:space="preserve">scripts/comparar_modelo_3090.sh &lt;id no Hugging Face&gt; &lt;nome curto&gt;</w:t>
+      </w:r>
+    </w:p>
+    <w:p>
+      <w:pPr>
+        <w:spacing w:after="120"/>
+      </w:pPr>
+      <w:r>
+        <w:t xml:space="preserve">Exemplos:</w:t>
+      </w:r>
+    </w:p>
+    <w:p>
+      <w:r>
+        <w:rPr>
+          <w:rFonts w:ascii="Consolas" w:cs="Consolas" w:eastAsia="Consolas" w:hAnsi="Consolas"/>
+          <w:sz w:val="18"/>
+          <w:szCs w:val="18"/>
+        </w:rPr>
+        <w:t xml:space="preserve">scripts/comparar_modelo_3090.sh Qwen/Qwen2.5-0.5B qwen05</w:t>
+      </w:r>
+    </w:p>
+    <w:p>
+      <w:r>
+        <w:rPr>
+          <w:rFonts w:ascii="Consolas" w:cs="Consolas" w:eastAsia="Consolas" w:hAnsi="Consolas"/>
+          <w:sz w:val="18"/>
+          <w:szCs w:val="18"/>
+        </w:rPr>
+        <w:t xml:space="preserve">scripts/comparar_modelo_3090.sh Qwen/Qwen2.5-1.5B qwen15</w:t>
+      </w:r>
+    </w:p>
+    <w:p>
+      <w:r>
+        <w:rPr>
+          <w:rFonts w:ascii="Consolas" w:cs="Consolas" w:eastAsia="Consolas" w:hAnsi="Consolas"/>
+          <w:sz w:val="18"/>
+          <w:szCs w:val="18"/>
+        </w:rPr>
+        <w:t xml:space="preserve">scripts/comparar_modelo_3090.sh TucanoBR/Tucano-2b4-instruct tucano</w:t>
+      </w:r>
+    </w:p>
+    <w:p>
+      <w:pPr>
+        <w:spacing w:after="120"/>
+      </w:pPr>
+      <w:r>
+        <w:t xml:space="preserve">O padrão (</w:t>
+      </w:r>
+      <w:r>
+        <w:rPr>
+          <w:rFonts w:ascii="Consolas" w:cs="Consolas" w:eastAsia="Consolas" w:hAnsi="Consolas"/>
+        </w:rPr>
+        <w:t xml:space="preserve">MODO=instruct</w:t>
+      </w:r>
+      <w:r>
+        <w:t xml:space="preserve">) treina como o modelo entregue: FastAPI junto com o mix de instrução do LNCC, no template </w:t>
+      </w:r>
+      <w:r>
+        <w:rPr>
+          <w:rFonts w:ascii="Consolas" w:cs="Consolas" w:eastAsia="Consolas" w:hAnsi="Consolas"/>
+        </w:rPr>
+        <w:t xml:space="preserve">lncc</w:t>
+      </w:r>
+      <w:r>
+        <w:t xml:space="preserve">. </w:t>
+      </w:r>
+      <w:r>
+        <w:rPr>
+          <w:rFonts w:ascii="Consolas" w:cs="Consolas" w:eastAsia="Consolas" w:hAnsi="Consolas"/>
+        </w:rPr>
+        <w:t xml:space="preserve">MODO=fastapi</w:t>
+      </w:r>
+      <w:r>
+        <w:t xml:space="preserve"> treina só com FastAPI, como no benchmark do Qwen acima. </w:t>
+      </w:r>
+      <w:r>
+        <w:rPr>
+          <w:rFonts w:ascii="Consolas" w:cs="Consolas" w:eastAsia="Consolas" w:hAnsi="Consolas"/>
+        </w:rPr>
+        <w:t xml:space="preserve">EPOCAS=</w:t>
+      </w:r>
+      <w:r>
+        <w:t xml:space="preserve"> muda o número de épocas.</w:t>
+      </w:r>
+    </w:p>
+    <w:p>
+      <w:pPr>
+        <w:spacing w:after="120"/>
+      </w:pPr>
+      <w:r>
+        <w:t xml:space="preserve">O script faz um smoke de 2 passos, o SFT, os dois evals, e imprime no fim uma linha pronta para a tabela:</w:t>
+      </w:r>
+    </w:p>
+    <w:p>
+      <w:r>
+        <w:rPr>
+          <w:rFonts w:ascii="Consolas" w:cs="Consolas" w:eastAsia="Consolas" w:hAnsi="Consolas"/>
+          <w:sz w:val="18"/>
+          <w:szCs w:val="18"/>
+        </w:rPr>
+        <w:t xml:space="preserve">| qwen05 | 1.0 | 1.0 | 1.0 | 18 de 18 |</w:t>
+      </w:r>
+    </w:p>
+    <w:p>
+      <w:pPr>
+        <w:spacing w:after="120"/>
+      </w:pPr>
+      <w:r>
+        <w:t xml:space="preserve">Os detalhes ficam em </w:t>
+      </w:r>
+      <w:r>
+        <w:rPr>
+          <w:rFonts w:ascii="Consolas" w:cs="Consolas" w:eastAsia="Consolas" w:hAnsi="Consolas"/>
+        </w:rPr>
+        <w:t xml:space="preserve">results/comparar_&lt;nome&gt;.json</w:t>
+      </w:r>
+      <w:r>
+        <w:t xml:space="preserve"> (todas as métricas e as 10 primeiras falhas), </w:t>
+      </w:r>
+      <w:r>
+        <w:rPr>
+          <w:rFonts w:ascii="Consolas" w:cs="Consolas" w:eastAsia="Consolas" w:hAnsi="Consolas"/>
+        </w:rPr>
+        <w:t xml:space="preserve">results/comparar_&lt;nome&gt;_pred.jsonl</w:t>
+      </w:r>
+      <w:r>
+        <w:t xml:space="preserve"> (os 182 arquivos gerados) e </w:t>
+      </w:r>
+      <w:r>
+        <w:rPr>
+          <w:rFonts w:ascii="Consolas" w:cs="Consolas" w:eastAsia="Consolas" w:hAnsi="Consolas"/>
+        </w:rPr>
+        <w:t xml:space="preserve">results/comparar_&lt;nome&gt;_conversa.jsonl</w:t>
+      </w:r>
+      <w:r>
+        <w:t xml:space="preserve"> (as 18 respostas de conversa).</w:t>
+      </w:r>
+    </w:p>
+    <w:p>
+      <w:pPr>
+        <w:spacing w:after="120"/>
+      </w:pPr>
+      <w:r>
+        <w:t xml:space="preserve">Requisitos do modelo:</w:t>
+      </w:r>
+    </w:p>
+    <w:p>
+      <w:pPr>
+        <w:pStyle w:val="ListParagraph"/>
+        <w:numPr>
+          <w:ilvl w:val="0"/>
+          <w:numId w:val="2"/>
+        </w:numPr>
+      </w:pPr>
+      <w:r>
+        <w:rPr>
+          <w:b/>
+          <w:bCs/>
+        </w:rPr>
+        <w:t xml:space="preserve">Ser suportado pelo transformers 4.46.3,</w:t>
+      </w:r>
+      <w:r>
+        <w:t xml:space="preserve"> o do ambiente da 3090. Llama, Qwen2, Mistral e Gemma 2 servem; o Qwen3 não, porque exige o 4.51.</w:t>
+      </w:r>
+    </w:p>
+    <w:p>
+      <w:pPr>
+        <w:pStyle w:val="ListParagraph"/>
+        <w:numPr>
+          <w:ilvl w:val="0"/>
+          <w:numId w:val="2"/>
+        </w:numPr>
+      </w:pPr>
+      <w:r>
+        <w:rPr>
+          <w:b/>
+          <w:bCs/>
+        </w:rPr>
+        <w:t xml:space="preserve">Ter as camadas com os nomes `q_proj`, `k_proj`, `v_proj`, `o_proj`, `gate_proj`, `up_proj` e `down_proj`,</w:t>
+      </w:r>
+      <w:r>
+        <w:t xml:space="preserve"> onde a LoRA é aplicada (</w:t>
+      </w:r>
+      <w:r>
+        <w:rPr>
+          <w:rFonts w:ascii="Consolas" w:cs="Consolas" w:eastAsia="Consolas" w:hAnsi="Consolas"/>
+        </w:rPr>
+        <w:t xml:space="preserve">LORA_ALVOS</w:t>
+      </w:r>
+      <w:r>
+        <w:t xml:space="preserve"> em </w:t>
+      </w:r>
+      <w:r>
+        <w:rPr>
+          <w:rFonts w:ascii="Consolas" w:cs="Consolas" w:eastAsia="Consolas" w:hAnsi="Consolas"/>
+        </w:rPr>
+        <w:t xml:space="preserve">scripts/train_qlora.py</w:t>
+      </w:r>
+      <w:r>
+        <w:t xml:space="preserve">). Modelos que juntam essas camadas, como o Phi-3, precisam mudar essa lista.</w:t>
+      </w:r>
+    </w:p>
+    <w:p>
+      <w:pPr>
+        <w:pStyle w:val="ListParagraph"/>
+        <w:numPr>
+          <w:ilvl w:val="0"/>
+          <w:numId w:val="2"/>
+        </w:numPr>
+      </w:pPr>
+      <w:r>
+        <w:rPr>
+          <w:b/>
+          <w:bCs/>
+        </w:rPr>
+        <w:t xml:space="preserve">Caber na RTX 3090 em 4 bits.</w:t>
+      </w:r>
+      <w:r>
+        <w:t xml:space="preserve"> Até uns 3 bilhões de parâmetros cabe com folga.</w:t>
+      </w:r>
+    </w:p>
+    <w:p>
+      <w:pPr>
+        <w:pStyle w:val="ListParagraph"/>
+        <w:numPr>
+          <w:ilvl w:val="0"/>
+          <w:numId w:val="2"/>
+        </w:numPr>
+      </w:pPr>
+      <w:r>
+        <w:rPr>
+          <w:b/>
+          <w:bCs/>
+        </w:rPr>
+        <w:t xml:space="preserve">Ter licença que permita o uso pretendido.</w:t>
+      </w:r>
+      <w:r>
+        <w:t xml:space="preserve"> Modelos com acesso restrito, como o Llama 3.2, exigem aceitar a licença no Hugging Face e um </w:t>
+      </w:r>
+      <w:r>
+        <w:rPr>
+          <w:rFonts w:ascii="Consolas" w:cs="Consolas" w:eastAsia="Consolas" w:hAnsi="Consolas"/>
+        </w:rPr>
+        <w:t xml:space="preserve">HF_TOKEN</w:t>
+      </w:r>
+      <w:r>
+        <w:t xml:space="preserve"> no ambiente.</w:t>
+      </w:r>
+    </w:p>
+    <w:p>
+      <w:pPr>
+        <w:spacing w:after="120"/>
+      </w:pPr>
+      <w:r>
+        <w:t xml:space="preserve">O pad igual ao EOS (caso do Qwen) é resolvido sozinho pelo </w:t>
+      </w:r>
+      <w:r>
+        <w:rPr>
+          <w:rFonts w:ascii="Consolas" w:cs="Consolas" w:eastAsia="Consolas" w:hAnsi="Consolas"/>
+        </w:rPr>
+        <w:t xml:space="preserve">train_qlora.py</w:t>
+      </w:r>
+      <w:r>
+        <w:t xml:space="preserve">. O modelo é avaliado com o próprio tokenizer, sem os marcadores de caixa, que só valem para o tokenizer v4 do Manacá.</w:t>
+      </w:r>
+    </w:p>
+    <w:p>
+      <w:pPr>
+        <w:spacing w:after="120"/>
+      </w:pPr>
+      <w:r>
+        <w:t xml:space="preserve">Tempo: o Qwen2.5-0.5B levou 54 minutos no modo só FastAPI. No modo instruct o volume de texto é cerca de 30% maior, e o tempo cresce com o tamanho do modelo: um modelo de 1,5 bilhão deve levar algumas horas.</w:t>
+      </w:r>
+    </w:p>
+    <w:p>
+      <w:pPr>
+        <w:pStyle w:val="Heading1"/>
+      </w:pPr>
+      <w:r>
         <w:t xml:space="preserve">Arquivos</w:t>
       </w:r>
     </w:p>
@@ -2117,7 +4620,7 @@
       <w:r>
         <w:t xml:space="preserve">. É o esquema de </w:t>
       </w:r>
-      <w:hyperlink w:history="1" r:id="rIdbdb5sr5yyuicxf9xq9bn5">
+      <w:hyperlink w:history="1" r:id="rId6uxu_wxswfi3bj15uxnge">
         <w:r>
           <w:rPr>
             <w:rStyle w:val="Hyperlink"/>
@@ -2146,7 +4649,7 @@
       <w:r>
         <w:t xml:space="preserve"> em três etapas, todas na RTX 3090: código Python em português colhido do GitHub, Wikipédia e documentação do FastAPI (35 milhões de tokens); depois mais 65 milhões de tokens do </w:t>
       </w:r>
-      <w:hyperlink w:history="1" r:id="rIdxfkkkski0axfni0zirsok">
+      <w:hyperlink w:history="1" r:id="rIdvyi9heqa414vgsvkbv8yb">
         <w:r>
           <w:rPr>
             <w:rStyle w:val="Hyperlink"/>
@@ -2193,7 +4696,7 @@
       <w:r>
         <w:t xml:space="preserve"> com LoRA (QLoRA 4 bits), juntando os pedidos de FastAPI com 12.815 exemplos da receita de instrução do </w:t>
       </w:r>
-      <w:hyperlink w:history="1" r:id="rIdx0nk31wymzmvdt7whqhlw">
+      <w:hyperlink w:history="1" r:id="rIdc0fjckgx_ac9dlibi9aj9">
         <w:r>
           <w:rPr>
             <w:rStyle w:val="Hyperlink"/>

</xml_diff>